<commit_message>
Create files for footnotes.
</commit_message>
<xml_diff>
--- a/test/simple.docx
+++ b/test/simple.docx
@@ -1,15 +1,46 @@
 
 <file path=word/document.xml><?xml version="1.0" encoding="utf-8"?>
-<w:document xmlns:wpc="http://schemas.microsoft.com/office/word/2010/wordprocessingCanvas" xmlns:cx="http://schemas.microsoft.com/office/drawing/2014/chartex" xmlns:cx1="http://schemas.microsoft.com/office/drawing/2015/9/8/chartex" xmlns:cx2="http://schemas.microsoft.com/office/drawing/2015/10/21/chartex" xmlns:cx3="http://schemas.microsoft.com/office/drawing/2016/5/9/chartex" xmlns:cx4="http://schemas.microsoft.com/office/drawing/2016/5/10/chartex" xmlns:cx5="http://schemas.microsoft.com/office/drawing/2016/5/11/chartex" xmlns:cx6="http://schemas.microsoft.com/office/drawing/2016/5/12/chartex" xmlns:cx7="http://schemas.microsoft.com/office/drawing/2016/5/13/chartex" xmlns:cx8="http://schemas.microsoft.com/office/drawing/2016/5/14/chartex" xmlns:mc="http://schemas.openxmlformats.org/markup-compatibility/2006" xmlns:aink="http://schemas.microsoft.com/office/drawing/2016/ink" xmlns:am3d="http://schemas.microsoft.com/office/drawing/2017/model3d" xmlns:o="urn:schemas-microsoft-com:office:office" xmlns:oel="http://schemas.microsoft.com/office/2019/extlst" xmlns:r="http://schemas.openxmlformats.org/officeDocument/2006/relationships" xmlns:m="http://schemas.openxmlformats.org/officeDocument/2006/math" xmlns:v="urn:schemas-microsoft-com:vml" xmlns:wp14="http://schemas.microsoft.com/office/word/2010/wordprocessingDrawing" xmlns:wp="http://schemas.openxmlformats.org/drawingml/2006/wordprocessingDrawing" xmlns:w10="urn:schemas-microsoft-com:office:word" xmlns:w="http://schemas.openxmlformats.org/wordprocessingml/2006/main" xmlns:w14="http://schemas.microsoft.com/office/word/2010/wordml" xmlns:w15="http://schemas.microsoft.com/office/word/2012/wordml" xmlns:w16cex="http://schemas.microsoft.com/office/word/2018/wordml/cex" xmlns:w16cid="http://schemas.microsoft.com/office/word/2016/wordml/cid" xmlns:w16="http://schemas.microsoft.com/office/word/2018/wordml" xmlns:w16sdtdh="http://schemas.microsoft.com/office/word/2020/wordml/sdtdatahash" xmlns:w16se="http://schemas.microsoft.com/office/word/2015/wordml/symex" xmlns:wpg="http://schemas.microsoft.com/office/word/2010/wordprocessingGroup" xmlns:wpi="http://schemas.microsoft.com/office/word/2010/wordprocessingInk" xmlns:wne="http://schemas.microsoft.com/office/word/2006/wordml" xmlns:wps="http://schemas.microsoft.com/office/word/2010/wordprocessingShape" mc:Ignorable="w14 w15 w16se w16cid w16 w16cex w16sdtdh wp14">
+<w:document xmlns:wpc="http://schemas.microsoft.com/office/word/2010/wordprocessingCanvas" xmlns:cx="http://schemas.microsoft.com/office/drawing/2014/chartex" xmlns:cx1="http://schemas.microsoft.com/office/drawing/2015/9/8/chartex" xmlns:cx2="http://schemas.microsoft.com/office/drawing/2015/10/21/chartex" xmlns:cx3="http://schemas.microsoft.com/office/drawing/2016/5/9/chartex" xmlns:cx4="http://schemas.microsoft.com/office/drawing/2016/5/10/chartex" xmlns:cx5="http://schemas.microsoft.com/office/drawing/2016/5/11/chartex" xmlns:cx6="http://schemas.microsoft.com/office/drawing/2016/5/12/chartex" xmlns:cx7="http://schemas.microsoft.com/office/drawing/2016/5/13/chartex" xmlns:cx8="http://schemas.microsoft.com/office/drawing/2016/5/14/chartex" xmlns:mc="http://schemas.openxmlformats.org/markup-compatibility/2006" xmlns:aink="http://schemas.microsoft.com/office/drawing/2016/ink" xmlns:am3d="http://schemas.microsoft.com/office/drawing/2017/model3d" xmlns:o="urn:schemas-microsoft-com:office:office" xmlns:oel="http://schemas.microsoft.com/office/2019/extlst" xmlns:r="http://schemas.openxmlformats.org/officeDocument/2006/relationships" xmlns:m="http://schemas.openxmlformats.org/officeDocument/2006/math" xmlns:v="urn:schemas-microsoft-com:vml" xmlns:wp14="http://schemas.microsoft.com/office/word/2010/wordprocessingDrawing" xmlns:wp="http://schemas.openxmlformats.org/drawingml/2006/wordprocessingDrawing" xmlns:w10="urn:schemas-microsoft-com:office:word" xmlns:w="http://schemas.openxmlformats.org/wordprocessingml/2006/main" xmlns:w14="http://schemas.microsoft.com/office/word/2010/wordml" xmlns:w15="http://schemas.microsoft.com/office/word/2012/wordml" xmlns:w16cex="http://schemas.microsoft.com/office/word/2018/wordml/cex" xmlns:w16cid="http://schemas.microsoft.com/office/word/2016/wordml/cid" xmlns:w16="http://schemas.microsoft.com/office/word/2018/wordml" xmlns:w16du="http://schemas.microsoft.com/office/word/2023/wordml/word16du" xmlns:w16sdtdh="http://schemas.microsoft.com/office/word/2020/wordml/sdtdatahash" xmlns:w16sdtfl="http://schemas.microsoft.com/office/word/2024/wordml/sdtformatlock" xmlns:w16se="http://schemas.microsoft.com/office/word/2015/wordml/symex" xmlns:wpg="http://schemas.microsoft.com/office/word/2010/wordprocessingGroup" xmlns:wpi="http://schemas.microsoft.com/office/word/2010/wordprocessingInk" xmlns:wne="http://schemas.microsoft.com/office/word/2006/wordml" xmlns:wps="http://schemas.microsoft.com/office/word/2010/wordprocessingShape" mc:Ignorable="w14 w15 w16se w16cid w16 w16cex w16sdtdh w16sdtfl w16du wp14">
   <w:body>
-    <w:p/>
+    <w:p>
+      <w:proofErr w:type="spellStart"/>
+      <w:r>
+        <w:t>Adding</w:t>
+      </w:r>
+      <w:proofErr w:type="spellEnd"/>
+      <w:r>
+        <w:t xml:space="preserve"> a </w:t>
+      </w:r>
+      <w:proofErr w:type="spellStart"/>
+      <w:r>
+        <w:t>Footnote</w:t>
+      </w:r>
+      <w:proofErr w:type="spellEnd"/>
+      <w:r>
+        <w:t xml:space="preserve"> </w:t>
+      </w:r>
+      <w:proofErr w:type="spellStart"/>
+      <w:r>
+        <w:t>as</w:t>
+      </w:r>
+      <w:proofErr w:type="spellEnd"/>
+      <w:r>
+        <w:t xml:space="preserve"> a test.</w:t>
+      </w:r>
+      <w:r>
+        <w:rPr>
+          <w:rStyle w:val="FootnoteReference"/>
+        </w:rPr>
+        <w:footnoteReference w:id="1"/>
+      </w:r>
+    </w:p>
     <w:sectPr>
-      <w:headerReference w:type="even" r:id="rId6"/>
-      <w:headerReference w:type="default" r:id="rId7"/>
-      <w:footerReference w:type="even" r:id="rId8"/>
-      <w:footerReference w:type="default" r:id="rId9"/>
-      <w:headerReference w:type="first" r:id="rId10"/>
-      <w:footerReference w:type="first" r:id="rId11"/>
+      <w:headerReference w:type="even" r:id="rId7"/>
+      <w:headerReference w:type="default" r:id="rId8"/>
+      <w:footerReference w:type="even" r:id="rId9"/>
+      <w:footerReference w:type="default" r:id="rId10"/>
+      <w:headerReference w:type="first" r:id="rId11"/>
+      <w:footerReference w:type="first" r:id="rId12"/>
       <w:pgSz w:w="11906" w:h="16838"/>
       <w:pgMar w:top="1440" w:right="1440" w:bottom="1440" w:left="1440" w:header="708" w:footer="708" w:gutter="0"/>
       <w:cols w:space="708"/>
@@ -20,7 +51,7 @@
 </file>
 
 <file path=word/endnotes.xml><?xml version="1.0" encoding="utf-8"?>
-<w:endnotes xmlns:wpc="http://schemas.microsoft.com/office/word/2010/wordprocessingCanvas" xmlns:cx="http://schemas.microsoft.com/office/drawing/2014/chartex" xmlns:cx1="http://schemas.microsoft.com/office/drawing/2015/9/8/chartex" xmlns:cx2="http://schemas.microsoft.com/office/drawing/2015/10/21/chartex" xmlns:cx3="http://schemas.microsoft.com/office/drawing/2016/5/9/chartex" xmlns:cx4="http://schemas.microsoft.com/office/drawing/2016/5/10/chartex" xmlns:cx5="http://schemas.microsoft.com/office/drawing/2016/5/11/chartex" xmlns:cx6="http://schemas.microsoft.com/office/drawing/2016/5/12/chartex" xmlns:cx7="http://schemas.microsoft.com/office/drawing/2016/5/13/chartex" xmlns:cx8="http://schemas.microsoft.com/office/drawing/2016/5/14/chartex" xmlns:mc="http://schemas.openxmlformats.org/markup-compatibility/2006" xmlns:aink="http://schemas.microsoft.com/office/drawing/2016/ink" xmlns:am3d="http://schemas.microsoft.com/office/drawing/2017/model3d" xmlns:o="urn:schemas-microsoft-com:office:office" xmlns:oel="http://schemas.microsoft.com/office/2019/extlst" xmlns:r="http://schemas.openxmlformats.org/officeDocument/2006/relationships" xmlns:m="http://schemas.openxmlformats.org/officeDocument/2006/math" xmlns:v="urn:schemas-microsoft-com:vml" xmlns:wp14="http://schemas.microsoft.com/office/word/2010/wordprocessingDrawing" xmlns:wp="http://schemas.openxmlformats.org/drawingml/2006/wordprocessingDrawing" xmlns:w10="urn:schemas-microsoft-com:office:word" xmlns:w="http://schemas.openxmlformats.org/wordprocessingml/2006/main" xmlns:w14="http://schemas.microsoft.com/office/word/2010/wordml" xmlns:w15="http://schemas.microsoft.com/office/word/2012/wordml" xmlns:w16cex="http://schemas.microsoft.com/office/word/2018/wordml/cex" xmlns:w16cid="http://schemas.microsoft.com/office/word/2016/wordml/cid" xmlns:w16="http://schemas.microsoft.com/office/word/2018/wordml" xmlns:w16sdtdh="http://schemas.microsoft.com/office/word/2020/wordml/sdtdatahash" xmlns:w16se="http://schemas.microsoft.com/office/word/2015/wordml/symex" xmlns:wpg="http://schemas.microsoft.com/office/word/2010/wordprocessingGroup" xmlns:wpi="http://schemas.microsoft.com/office/word/2010/wordprocessingInk" xmlns:wne="http://schemas.microsoft.com/office/word/2006/wordml" xmlns:wps="http://schemas.microsoft.com/office/word/2010/wordprocessingShape" mc:Ignorable="w14 w15 w16se w16cid w16 w16cex w16sdtdh wp14">
+<w:endnotes xmlns:wpc="http://schemas.microsoft.com/office/word/2010/wordprocessingCanvas" xmlns:cx="http://schemas.microsoft.com/office/drawing/2014/chartex" xmlns:cx1="http://schemas.microsoft.com/office/drawing/2015/9/8/chartex" xmlns:cx2="http://schemas.microsoft.com/office/drawing/2015/10/21/chartex" xmlns:cx3="http://schemas.microsoft.com/office/drawing/2016/5/9/chartex" xmlns:cx4="http://schemas.microsoft.com/office/drawing/2016/5/10/chartex" xmlns:cx5="http://schemas.microsoft.com/office/drawing/2016/5/11/chartex" xmlns:cx6="http://schemas.microsoft.com/office/drawing/2016/5/12/chartex" xmlns:cx7="http://schemas.microsoft.com/office/drawing/2016/5/13/chartex" xmlns:cx8="http://schemas.microsoft.com/office/drawing/2016/5/14/chartex" xmlns:mc="http://schemas.openxmlformats.org/markup-compatibility/2006" xmlns:aink="http://schemas.microsoft.com/office/drawing/2016/ink" xmlns:am3d="http://schemas.microsoft.com/office/drawing/2017/model3d" xmlns:o="urn:schemas-microsoft-com:office:office" xmlns:oel="http://schemas.microsoft.com/office/2019/extlst" xmlns:r="http://schemas.openxmlformats.org/officeDocument/2006/relationships" xmlns:m="http://schemas.openxmlformats.org/officeDocument/2006/math" xmlns:v="urn:schemas-microsoft-com:vml" xmlns:wp14="http://schemas.microsoft.com/office/word/2010/wordprocessingDrawing" xmlns:wp="http://schemas.openxmlformats.org/drawingml/2006/wordprocessingDrawing" xmlns:w10="urn:schemas-microsoft-com:office:word" xmlns:w="http://schemas.openxmlformats.org/wordprocessingml/2006/main" xmlns:w14="http://schemas.microsoft.com/office/word/2010/wordml" xmlns:w15="http://schemas.microsoft.com/office/word/2012/wordml" xmlns:w16cex="http://schemas.microsoft.com/office/word/2018/wordml/cex" xmlns:w16cid="http://schemas.microsoft.com/office/word/2016/wordml/cid" xmlns:w16="http://schemas.microsoft.com/office/word/2018/wordml" xmlns:w16du="http://schemas.microsoft.com/office/word/2023/wordml/word16du" xmlns:w16sdtdh="http://schemas.microsoft.com/office/word/2020/wordml/sdtdatahash" xmlns:w16sdtfl="http://schemas.microsoft.com/office/word/2024/wordml/sdtformatlock" xmlns:w16se="http://schemas.microsoft.com/office/word/2015/wordml/symex" xmlns:wpg="http://schemas.microsoft.com/office/word/2010/wordprocessingGroup" xmlns:wpi="http://schemas.microsoft.com/office/word/2010/wordprocessingInk" xmlns:wne="http://schemas.microsoft.com/office/word/2006/wordml" xmlns:wps="http://schemas.microsoft.com/office/word/2010/wordprocessingShape" mc:Ignorable="w14 w15 w16se w16cid w16 w16cex w16sdtdh w16sdtfl w16du wp14">
   <w:endnote w:type="separator" w:id="-1">
     <w:p>
       <w:pPr>
@@ -45,7 +76,7 @@
 </file>
 
 <file path=word/footer1.xml><?xml version="1.0" encoding="utf-8"?>
-<w:ftr xmlns:wpc="http://schemas.microsoft.com/office/word/2010/wordprocessingCanvas" xmlns:cx="http://schemas.microsoft.com/office/drawing/2014/chartex" xmlns:cx1="http://schemas.microsoft.com/office/drawing/2015/9/8/chartex" xmlns:cx2="http://schemas.microsoft.com/office/drawing/2015/10/21/chartex" xmlns:cx3="http://schemas.microsoft.com/office/drawing/2016/5/9/chartex" xmlns:cx4="http://schemas.microsoft.com/office/drawing/2016/5/10/chartex" xmlns:cx5="http://schemas.microsoft.com/office/drawing/2016/5/11/chartex" xmlns:cx6="http://schemas.microsoft.com/office/drawing/2016/5/12/chartex" xmlns:cx7="http://schemas.microsoft.com/office/drawing/2016/5/13/chartex" xmlns:cx8="http://schemas.microsoft.com/office/drawing/2016/5/14/chartex" xmlns:mc="http://schemas.openxmlformats.org/markup-compatibility/2006" xmlns:aink="http://schemas.microsoft.com/office/drawing/2016/ink" xmlns:am3d="http://schemas.microsoft.com/office/drawing/2017/model3d" xmlns:o="urn:schemas-microsoft-com:office:office" xmlns:oel="http://schemas.microsoft.com/office/2019/extlst" xmlns:r="http://schemas.openxmlformats.org/officeDocument/2006/relationships" xmlns:m="http://schemas.openxmlformats.org/officeDocument/2006/math" xmlns:v="urn:schemas-microsoft-com:vml" xmlns:wp14="http://schemas.microsoft.com/office/word/2010/wordprocessingDrawing" xmlns:wp="http://schemas.openxmlformats.org/drawingml/2006/wordprocessingDrawing" xmlns:w10="urn:schemas-microsoft-com:office:word" xmlns:w="http://schemas.openxmlformats.org/wordprocessingml/2006/main" xmlns:w14="http://schemas.microsoft.com/office/word/2010/wordml" xmlns:w15="http://schemas.microsoft.com/office/word/2012/wordml" xmlns:w16cex="http://schemas.microsoft.com/office/word/2018/wordml/cex" xmlns:w16cid="http://schemas.microsoft.com/office/word/2016/wordml/cid" xmlns:w16="http://schemas.microsoft.com/office/word/2018/wordml" xmlns:w16sdtdh="http://schemas.microsoft.com/office/word/2020/wordml/sdtdatahash" xmlns:w16se="http://schemas.microsoft.com/office/word/2015/wordml/symex" xmlns:wpg="http://schemas.microsoft.com/office/word/2010/wordprocessingGroup" xmlns:wpi="http://schemas.microsoft.com/office/word/2010/wordprocessingInk" xmlns:wne="http://schemas.microsoft.com/office/word/2006/wordml" xmlns:wps="http://schemas.microsoft.com/office/word/2010/wordprocessingShape" mc:Ignorable="w14 w15 w16se w16cid w16 w16cex w16sdtdh wp14">
+<w:ftr xmlns:wpc="http://schemas.microsoft.com/office/word/2010/wordprocessingCanvas" xmlns:cx="http://schemas.microsoft.com/office/drawing/2014/chartex" xmlns:cx1="http://schemas.microsoft.com/office/drawing/2015/9/8/chartex" xmlns:cx2="http://schemas.microsoft.com/office/drawing/2015/10/21/chartex" xmlns:cx3="http://schemas.microsoft.com/office/drawing/2016/5/9/chartex" xmlns:cx4="http://schemas.microsoft.com/office/drawing/2016/5/10/chartex" xmlns:cx5="http://schemas.microsoft.com/office/drawing/2016/5/11/chartex" xmlns:cx6="http://schemas.microsoft.com/office/drawing/2016/5/12/chartex" xmlns:cx7="http://schemas.microsoft.com/office/drawing/2016/5/13/chartex" xmlns:cx8="http://schemas.microsoft.com/office/drawing/2016/5/14/chartex" xmlns:mc="http://schemas.openxmlformats.org/markup-compatibility/2006" xmlns:aink="http://schemas.microsoft.com/office/drawing/2016/ink" xmlns:am3d="http://schemas.microsoft.com/office/drawing/2017/model3d" xmlns:o="urn:schemas-microsoft-com:office:office" xmlns:oel="http://schemas.microsoft.com/office/2019/extlst" xmlns:r="http://schemas.openxmlformats.org/officeDocument/2006/relationships" xmlns:m="http://schemas.openxmlformats.org/officeDocument/2006/math" xmlns:v="urn:schemas-microsoft-com:vml" xmlns:wp14="http://schemas.microsoft.com/office/word/2010/wordprocessingDrawing" xmlns:wp="http://schemas.openxmlformats.org/drawingml/2006/wordprocessingDrawing" xmlns:w10="urn:schemas-microsoft-com:office:word" xmlns:w="http://schemas.openxmlformats.org/wordprocessingml/2006/main" xmlns:w14="http://schemas.microsoft.com/office/word/2010/wordml" xmlns:w15="http://schemas.microsoft.com/office/word/2012/wordml" xmlns:w16cex="http://schemas.microsoft.com/office/word/2018/wordml/cex" xmlns:w16cid="http://schemas.microsoft.com/office/word/2016/wordml/cid" xmlns:w16="http://schemas.microsoft.com/office/word/2018/wordml" xmlns:w16du="http://schemas.microsoft.com/office/word/2023/wordml/word16du" xmlns:w16sdtdh="http://schemas.microsoft.com/office/word/2020/wordml/sdtdatahash" xmlns:w16sdtfl="http://schemas.microsoft.com/office/word/2024/wordml/sdtformatlock" xmlns:w16se="http://schemas.microsoft.com/office/word/2015/wordml/symex" xmlns:wpg="http://schemas.microsoft.com/office/word/2010/wordprocessingGroup" xmlns:wpi="http://schemas.microsoft.com/office/word/2010/wordprocessingInk" xmlns:wne="http://schemas.microsoft.com/office/word/2006/wordml" xmlns:wps="http://schemas.microsoft.com/office/word/2010/wordprocessingShape" mc:Ignorable="w14 w15 w16se w16cid w16 w16cex w16sdtdh w16sdtfl w16du wp14">
   <w:p>
     <w:pPr>
       <w:pStyle w:val="Footer"/>
@@ -55,7 +86,7 @@
 </file>
 
 <file path=word/footer2.xml><?xml version="1.0" encoding="utf-8"?>
-<w:ftr xmlns:wpc="http://schemas.microsoft.com/office/word/2010/wordprocessingCanvas" xmlns:cx="http://schemas.microsoft.com/office/drawing/2014/chartex" xmlns:cx1="http://schemas.microsoft.com/office/drawing/2015/9/8/chartex" xmlns:cx2="http://schemas.microsoft.com/office/drawing/2015/10/21/chartex" xmlns:cx3="http://schemas.microsoft.com/office/drawing/2016/5/9/chartex" xmlns:cx4="http://schemas.microsoft.com/office/drawing/2016/5/10/chartex" xmlns:cx5="http://schemas.microsoft.com/office/drawing/2016/5/11/chartex" xmlns:cx6="http://schemas.microsoft.com/office/drawing/2016/5/12/chartex" xmlns:cx7="http://schemas.microsoft.com/office/drawing/2016/5/13/chartex" xmlns:cx8="http://schemas.microsoft.com/office/drawing/2016/5/14/chartex" xmlns:mc="http://schemas.openxmlformats.org/markup-compatibility/2006" xmlns:aink="http://schemas.microsoft.com/office/drawing/2016/ink" xmlns:am3d="http://schemas.microsoft.com/office/drawing/2017/model3d" xmlns:o="urn:schemas-microsoft-com:office:office" xmlns:oel="http://schemas.microsoft.com/office/2019/extlst" xmlns:r="http://schemas.openxmlformats.org/officeDocument/2006/relationships" xmlns:m="http://schemas.openxmlformats.org/officeDocument/2006/math" xmlns:v="urn:schemas-microsoft-com:vml" xmlns:wp14="http://schemas.microsoft.com/office/word/2010/wordprocessingDrawing" xmlns:wp="http://schemas.openxmlformats.org/drawingml/2006/wordprocessingDrawing" xmlns:w10="urn:schemas-microsoft-com:office:word" xmlns:w="http://schemas.openxmlformats.org/wordprocessingml/2006/main" xmlns:w14="http://schemas.microsoft.com/office/word/2010/wordml" xmlns:w15="http://schemas.microsoft.com/office/word/2012/wordml" xmlns:w16cex="http://schemas.microsoft.com/office/word/2018/wordml/cex" xmlns:w16cid="http://schemas.microsoft.com/office/word/2016/wordml/cid" xmlns:w16="http://schemas.microsoft.com/office/word/2018/wordml" xmlns:w16sdtdh="http://schemas.microsoft.com/office/word/2020/wordml/sdtdatahash" xmlns:w16se="http://schemas.microsoft.com/office/word/2015/wordml/symex" xmlns:wpg="http://schemas.microsoft.com/office/word/2010/wordprocessingGroup" xmlns:wpi="http://schemas.microsoft.com/office/word/2010/wordprocessingInk" xmlns:wne="http://schemas.microsoft.com/office/word/2006/wordml" xmlns:wps="http://schemas.microsoft.com/office/word/2010/wordprocessingShape" mc:Ignorable="w14 w15 w16se w16cid w16 w16cex w16sdtdh wp14">
+<w:ftr xmlns:wpc="http://schemas.microsoft.com/office/word/2010/wordprocessingCanvas" xmlns:cx="http://schemas.microsoft.com/office/drawing/2014/chartex" xmlns:cx1="http://schemas.microsoft.com/office/drawing/2015/9/8/chartex" xmlns:cx2="http://schemas.microsoft.com/office/drawing/2015/10/21/chartex" xmlns:cx3="http://schemas.microsoft.com/office/drawing/2016/5/9/chartex" xmlns:cx4="http://schemas.microsoft.com/office/drawing/2016/5/10/chartex" xmlns:cx5="http://schemas.microsoft.com/office/drawing/2016/5/11/chartex" xmlns:cx6="http://schemas.microsoft.com/office/drawing/2016/5/12/chartex" xmlns:cx7="http://schemas.microsoft.com/office/drawing/2016/5/13/chartex" xmlns:cx8="http://schemas.microsoft.com/office/drawing/2016/5/14/chartex" xmlns:mc="http://schemas.openxmlformats.org/markup-compatibility/2006" xmlns:aink="http://schemas.microsoft.com/office/drawing/2016/ink" xmlns:am3d="http://schemas.microsoft.com/office/drawing/2017/model3d" xmlns:o="urn:schemas-microsoft-com:office:office" xmlns:oel="http://schemas.microsoft.com/office/2019/extlst" xmlns:r="http://schemas.openxmlformats.org/officeDocument/2006/relationships" xmlns:m="http://schemas.openxmlformats.org/officeDocument/2006/math" xmlns:v="urn:schemas-microsoft-com:vml" xmlns:wp14="http://schemas.microsoft.com/office/word/2010/wordprocessingDrawing" xmlns:wp="http://schemas.openxmlformats.org/drawingml/2006/wordprocessingDrawing" xmlns:w10="urn:schemas-microsoft-com:office:word" xmlns:w="http://schemas.openxmlformats.org/wordprocessingml/2006/main" xmlns:w14="http://schemas.microsoft.com/office/word/2010/wordml" xmlns:w15="http://schemas.microsoft.com/office/word/2012/wordml" xmlns:w16cex="http://schemas.microsoft.com/office/word/2018/wordml/cex" xmlns:w16cid="http://schemas.microsoft.com/office/word/2016/wordml/cid" xmlns:w16="http://schemas.microsoft.com/office/word/2018/wordml" xmlns:w16du="http://schemas.microsoft.com/office/word/2023/wordml/word16du" xmlns:w16sdtdh="http://schemas.microsoft.com/office/word/2020/wordml/sdtdatahash" xmlns:w16sdtfl="http://schemas.microsoft.com/office/word/2024/wordml/sdtformatlock" xmlns:w16se="http://schemas.microsoft.com/office/word/2015/wordml/symex" xmlns:wpg="http://schemas.microsoft.com/office/word/2010/wordprocessingGroup" xmlns:wpi="http://schemas.microsoft.com/office/word/2010/wordprocessingInk" xmlns:wne="http://schemas.microsoft.com/office/word/2006/wordml" xmlns:wps="http://schemas.microsoft.com/office/word/2010/wordprocessingShape" mc:Ignorable="w14 w15 w16se w16cid w16 w16cex w16sdtdh w16sdtfl w16du wp14">
   <w:p>
     <w:pPr>
       <w:pStyle w:val="Footer"/>
@@ -65,7 +96,7 @@
 </file>
 
 <file path=word/footer3.xml><?xml version="1.0" encoding="utf-8"?>
-<w:ftr xmlns:wpc="http://schemas.microsoft.com/office/word/2010/wordprocessingCanvas" xmlns:cx="http://schemas.microsoft.com/office/drawing/2014/chartex" xmlns:cx1="http://schemas.microsoft.com/office/drawing/2015/9/8/chartex" xmlns:cx2="http://schemas.microsoft.com/office/drawing/2015/10/21/chartex" xmlns:cx3="http://schemas.microsoft.com/office/drawing/2016/5/9/chartex" xmlns:cx4="http://schemas.microsoft.com/office/drawing/2016/5/10/chartex" xmlns:cx5="http://schemas.microsoft.com/office/drawing/2016/5/11/chartex" xmlns:cx6="http://schemas.microsoft.com/office/drawing/2016/5/12/chartex" xmlns:cx7="http://schemas.microsoft.com/office/drawing/2016/5/13/chartex" xmlns:cx8="http://schemas.microsoft.com/office/drawing/2016/5/14/chartex" xmlns:mc="http://schemas.openxmlformats.org/markup-compatibility/2006" xmlns:aink="http://schemas.microsoft.com/office/drawing/2016/ink" xmlns:am3d="http://schemas.microsoft.com/office/drawing/2017/model3d" xmlns:o="urn:schemas-microsoft-com:office:office" xmlns:oel="http://schemas.microsoft.com/office/2019/extlst" xmlns:r="http://schemas.openxmlformats.org/officeDocument/2006/relationships" xmlns:m="http://schemas.openxmlformats.org/officeDocument/2006/math" xmlns:v="urn:schemas-microsoft-com:vml" xmlns:wp14="http://schemas.microsoft.com/office/word/2010/wordprocessingDrawing" xmlns:wp="http://schemas.openxmlformats.org/drawingml/2006/wordprocessingDrawing" xmlns:w10="urn:schemas-microsoft-com:office:word" xmlns:w="http://schemas.openxmlformats.org/wordprocessingml/2006/main" xmlns:w14="http://schemas.microsoft.com/office/word/2010/wordml" xmlns:w15="http://schemas.microsoft.com/office/word/2012/wordml" xmlns:w16cex="http://schemas.microsoft.com/office/word/2018/wordml/cex" xmlns:w16cid="http://schemas.microsoft.com/office/word/2016/wordml/cid" xmlns:w16="http://schemas.microsoft.com/office/word/2018/wordml" xmlns:w16sdtdh="http://schemas.microsoft.com/office/word/2020/wordml/sdtdatahash" xmlns:w16se="http://schemas.microsoft.com/office/word/2015/wordml/symex" xmlns:wpg="http://schemas.microsoft.com/office/word/2010/wordprocessingGroup" xmlns:wpi="http://schemas.microsoft.com/office/word/2010/wordprocessingInk" xmlns:wne="http://schemas.microsoft.com/office/word/2006/wordml" xmlns:wps="http://schemas.microsoft.com/office/word/2010/wordprocessingShape" mc:Ignorable="w14 w15 w16se w16cid w16 w16cex w16sdtdh wp14">
+<w:ftr xmlns:wpc="http://schemas.microsoft.com/office/word/2010/wordprocessingCanvas" xmlns:cx="http://schemas.microsoft.com/office/drawing/2014/chartex" xmlns:cx1="http://schemas.microsoft.com/office/drawing/2015/9/8/chartex" xmlns:cx2="http://schemas.microsoft.com/office/drawing/2015/10/21/chartex" xmlns:cx3="http://schemas.microsoft.com/office/drawing/2016/5/9/chartex" xmlns:cx4="http://schemas.microsoft.com/office/drawing/2016/5/10/chartex" xmlns:cx5="http://schemas.microsoft.com/office/drawing/2016/5/11/chartex" xmlns:cx6="http://schemas.microsoft.com/office/drawing/2016/5/12/chartex" xmlns:cx7="http://schemas.microsoft.com/office/drawing/2016/5/13/chartex" xmlns:cx8="http://schemas.microsoft.com/office/drawing/2016/5/14/chartex" xmlns:mc="http://schemas.openxmlformats.org/markup-compatibility/2006" xmlns:aink="http://schemas.microsoft.com/office/drawing/2016/ink" xmlns:am3d="http://schemas.microsoft.com/office/drawing/2017/model3d" xmlns:o="urn:schemas-microsoft-com:office:office" xmlns:oel="http://schemas.microsoft.com/office/2019/extlst" xmlns:r="http://schemas.openxmlformats.org/officeDocument/2006/relationships" xmlns:m="http://schemas.openxmlformats.org/officeDocument/2006/math" xmlns:v="urn:schemas-microsoft-com:vml" xmlns:wp14="http://schemas.microsoft.com/office/word/2010/wordprocessingDrawing" xmlns:wp="http://schemas.openxmlformats.org/drawingml/2006/wordprocessingDrawing" xmlns:w10="urn:schemas-microsoft-com:office:word" xmlns:w="http://schemas.openxmlformats.org/wordprocessingml/2006/main" xmlns:w14="http://schemas.microsoft.com/office/word/2010/wordml" xmlns:w15="http://schemas.microsoft.com/office/word/2012/wordml" xmlns:w16cex="http://schemas.microsoft.com/office/word/2018/wordml/cex" xmlns:w16cid="http://schemas.microsoft.com/office/word/2016/wordml/cid" xmlns:w16="http://schemas.microsoft.com/office/word/2018/wordml" xmlns:w16du="http://schemas.microsoft.com/office/word/2023/wordml/word16du" xmlns:w16sdtdh="http://schemas.microsoft.com/office/word/2020/wordml/sdtdatahash" xmlns:w16sdtfl="http://schemas.microsoft.com/office/word/2024/wordml/sdtformatlock" xmlns:w16se="http://schemas.microsoft.com/office/word/2015/wordml/symex" xmlns:wpg="http://schemas.microsoft.com/office/word/2010/wordprocessingGroup" xmlns:wpi="http://schemas.microsoft.com/office/word/2010/wordprocessingInk" xmlns:wne="http://schemas.microsoft.com/office/word/2006/wordml" xmlns:wps="http://schemas.microsoft.com/office/word/2010/wordprocessingShape" mc:Ignorable="w14 w15 w16se w16cid w16 w16cex w16sdtdh w16sdtfl w16du wp14">
   <w:p>
     <w:pPr>
       <w:pStyle w:val="Footer"/>
@@ -75,7 +106,7 @@
 </file>
 
 <file path=word/footnotes.xml><?xml version="1.0" encoding="utf-8"?>
-<w:footnotes xmlns:wpc="http://schemas.microsoft.com/office/word/2010/wordprocessingCanvas" xmlns:cx="http://schemas.microsoft.com/office/drawing/2014/chartex" xmlns:cx1="http://schemas.microsoft.com/office/drawing/2015/9/8/chartex" xmlns:cx2="http://schemas.microsoft.com/office/drawing/2015/10/21/chartex" xmlns:cx3="http://schemas.microsoft.com/office/drawing/2016/5/9/chartex" xmlns:cx4="http://schemas.microsoft.com/office/drawing/2016/5/10/chartex" xmlns:cx5="http://schemas.microsoft.com/office/drawing/2016/5/11/chartex" xmlns:cx6="http://schemas.microsoft.com/office/drawing/2016/5/12/chartex" xmlns:cx7="http://schemas.microsoft.com/office/drawing/2016/5/13/chartex" xmlns:cx8="http://schemas.microsoft.com/office/drawing/2016/5/14/chartex" xmlns:mc="http://schemas.openxmlformats.org/markup-compatibility/2006" xmlns:aink="http://schemas.microsoft.com/office/drawing/2016/ink" xmlns:am3d="http://schemas.microsoft.com/office/drawing/2017/model3d" xmlns:o="urn:schemas-microsoft-com:office:office" xmlns:oel="http://schemas.microsoft.com/office/2019/extlst" xmlns:r="http://schemas.openxmlformats.org/officeDocument/2006/relationships" xmlns:m="http://schemas.openxmlformats.org/officeDocument/2006/math" xmlns:v="urn:schemas-microsoft-com:vml" xmlns:wp14="http://schemas.microsoft.com/office/word/2010/wordprocessingDrawing" xmlns:wp="http://schemas.openxmlformats.org/drawingml/2006/wordprocessingDrawing" xmlns:w10="urn:schemas-microsoft-com:office:word" xmlns:w="http://schemas.openxmlformats.org/wordprocessingml/2006/main" xmlns:w14="http://schemas.microsoft.com/office/word/2010/wordml" xmlns:w15="http://schemas.microsoft.com/office/word/2012/wordml" xmlns:w16cex="http://schemas.microsoft.com/office/word/2018/wordml/cex" xmlns:w16cid="http://schemas.microsoft.com/office/word/2016/wordml/cid" xmlns:w16="http://schemas.microsoft.com/office/word/2018/wordml" xmlns:w16sdtdh="http://schemas.microsoft.com/office/word/2020/wordml/sdtdatahash" xmlns:w16se="http://schemas.microsoft.com/office/word/2015/wordml/symex" xmlns:wpg="http://schemas.microsoft.com/office/word/2010/wordprocessingGroup" xmlns:wpi="http://schemas.microsoft.com/office/word/2010/wordprocessingInk" xmlns:wne="http://schemas.microsoft.com/office/word/2006/wordml" xmlns:wps="http://schemas.microsoft.com/office/word/2010/wordprocessingShape" mc:Ignorable="w14 w15 w16se w16cid w16 w16cex w16sdtdh wp14">
+<w:footnotes xmlns:wpc="http://schemas.microsoft.com/office/word/2010/wordprocessingCanvas" xmlns:cx="http://schemas.microsoft.com/office/drawing/2014/chartex" xmlns:cx1="http://schemas.microsoft.com/office/drawing/2015/9/8/chartex" xmlns:cx2="http://schemas.microsoft.com/office/drawing/2015/10/21/chartex" xmlns:cx3="http://schemas.microsoft.com/office/drawing/2016/5/9/chartex" xmlns:cx4="http://schemas.microsoft.com/office/drawing/2016/5/10/chartex" xmlns:cx5="http://schemas.microsoft.com/office/drawing/2016/5/11/chartex" xmlns:cx6="http://schemas.microsoft.com/office/drawing/2016/5/12/chartex" xmlns:cx7="http://schemas.microsoft.com/office/drawing/2016/5/13/chartex" xmlns:cx8="http://schemas.microsoft.com/office/drawing/2016/5/14/chartex" xmlns:mc="http://schemas.openxmlformats.org/markup-compatibility/2006" xmlns:aink="http://schemas.microsoft.com/office/drawing/2016/ink" xmlns:am3d="http://schemas.microsoft.com/office/drawing/2017/model3d" xmlns:o="urn:schemas-microsoft-com:office:office" xmlns:oel="http://schemas.microsoft.com/office/2019/extlst" xmlns:r="http://schemas.openxmlformats.org/officeDocument/2006/relationships" xmlns:m="http://schemas.openxmlformats.org/officeDocument/2006/math" xmlns:v="urn:schemas-microsoft-com:vml" xmlns:wp14="http://schemas.microsoft.com/office/word/2010/wordprocessingDrawing" xmlns:wp="http://schemas.openxmlformats.org/drawingml/2006/wordprocessingDrawing" xmlns:w10="urn:schemas-microsoft-com:office:word" xmlns:w="http://schemas.openxmlformats.org/wordprocessingml/2006/main" xmlns:w14="http://schemas.microsoft.com/office/word/2010/wordml" xmlns:w15="http://schemas.microsoft.com/office/word/2012/wordml" xmlns:w16cex="http://schemas.microsoft.com/office/word/2018/wordml/cex" xmlns:w16cid="http://schemas.microsoft.com/office/word/2016/wordml/cid" xmlns:w16="http://schemas.microsoft.com/office/word/2018/wordml" xmlns:w16du="http://schemas.microsoft.com/office/word/2023/wordml/word16du" xmlns:w16sdtdh="http://schemas.microsoft.com/office/word/2020/wordml/sdtdatahash" xmlns:w16sdtfl="http://schemas.microsoft.com/office/word/2024/wordml/sdtformatlock" xmlns:w16se="http://schemas.microsoft.com/office/word/2015/wordml/symex" xmlns:wpg="http://schemas.microsoft.com/office/word/2010/wordprocessingGroup" xmlns:wpi="http://schemas.microsoft.com/office/word/2010/wordprocessingInk" xmlns:wne="http://schemas.microsoft.com/office/word/2006/wordml" xmlns:wps="http://schemas.microsoft.com/office/word/2010/wordprocessingShape" mc:Ignorable="w14 w15 w16se w16cid w16 w16cex w16sdtdh w16sdtfl w16du wp14">
   <w:footnote w:type="separator" w:id="-1">
     <w:p>
       <w:pPr>
@@ -96,11 +127,36 @@
       </w:r>
     </w:p>
   </w:footnote>
+  <w:footnote w:id="1">
+    <w:p>
+      <w:pPr>
+        <w:pStyle w:val="FootnoteText"/>
+        <w:rPr>
+          <w:lang w:val="en-US"/>
+        </w:rPr>
+      </w:pPr>
+      <w:r>
+        <w:rPr>
+          <w:rStyle w:val="FootnoteReference"/>
+        </w:rPr>
+        <w:footnoteRef/>
+      </w:r>
+      <w:r>
+        <w:t xml:space="preserve"> </w:t>
+      </w:r>
+      <w:r>
+        <w:rPr>
+          <w:lang w:val="en-US"/>
+        </w:rPr>
+        <w:t>Footnote One.</w:t>
+      </w:r>
+    </w:p>
+  </w:footnote>
 </w:footnotes>
 </file>
 
 <file path=word/header1.xml><?xml version="1.0" encoding="utf-8"?>
-<w:hdr xmlns:wpc="http://schemas.microsoft.com/office/word/2010/wordprocessingCanvas" xmlns:cx="http://schemas.microsoft.com/office/drawing/2014/chartex" xmlns:cx1="http://schemas.microsoft.com/office/drawing/2015/9/8/chartex" xmlns:cx2="http://schemas.microsoft.com/office/drawing/2015/10/21/chartex" xmlns:cx3="http://schemas.microsoft.com/office/drawing/2016/5/9/chartex" xmlns:cx4="http://schemas.microsoft.com/office/drawing/2016/5/10/chartex" xmlns:cx5="http://schemas.microsoft.com/office/drawing/2016/5/11/chartex" xmlns:cx6="http://schemas.microsoft.com/office/drawing/2016/5/12/chartex" xmlns:cx7="http://schemas.microsoft.com/office/drawing/2016/5/13/chartex" xmlns:cx8="http://schemas.microsoft.com/office/drawing/2016/5/14/chartex" xmlns:mc="http://schemas.openxmlformats.org/markup-compatibility/2006" xmlns:aink="http://schemas.microsoft.com/office/drawing/2016/ink" xmlns:am3d="http://schemas.microsoft.com/office/drawing/2017/model3d" xmlns:o="urn:schemas-microsoft-com:office:office" xmlns:oel="http://schemas.microsoft.com/office/2019/extlst" xmlns:r="http://schemas.openxmlformats.org/officeDocument/2006/relationships" xmlns:m="http://schemas.openxmlformats.org/officeDocument/2006/math" xmlns:v="urn:schemas-microsoft-com:vml" xmlns:wp14="http://schemas.microsoft.com/office/word/2010/wordprocessingDrawing" xmlns:wp="http://schemas.openxmlformats.org/drawingml/2006/wordprocessingDrawing" xmlns:w10="urn:schemas-microsoft-com:office:word" xmlns:w="http://schemas.openxmlformats.org/wordprocessingml/2006/main" xmlns:w14="http://schemas.microsoft.com/office/word/2010/wordml" xmlns:w15="http://schemas.microsoft.com/office/word/2012/wordml" xmlns:w16cex="http://schemas.microsoft.com/office/word/2018/wordml/cex" xmlns:w16cid="http://schemas.microsoft.com/office/word/2016/wordml/cid" xmlns:w16="http://schemas.microsoft.com/office/word/2018/wordml" xmlns:w16sdtdh="http://schemas.microsoft.com/office/word/2020/wordml/sdtdatahash" xmlns:w16se="http://schemas.microsoft.com/office/word/2015/wordml/symex" xmlns:wpg="http://schemas.microsoft.com/office/word/2010/wordprocessingGroup" xmlns:wpi="http://schemas.microsoft.com/office/word/2010/wordprocessingInk" xmlns:wne="http://schemas.microsoft.com/office/word/2006/wordml" xmlns:wps="http://schemas.microsoft.com/office/word/2010/wordprocessingShape" mc:Ignorable="w14 w15 w16se w16cid w16 w16cex w16sdtdh wp14">
+<w:hdr xmlns:wpc="http://schemas.microsoft.com/office/word/2010/wordprocessingCanvas" xmlns:cx="http://schemas.microsoft.com/office/drawing/2014/chartex" xmlns:cx1="http://schemas.microsoft.com/office/drawing/2015/9/8/chartex" xmlns:cx2="http://schemas.microsoft.com/office/drawing/2015/10/21/chartex" xmlns:cx3="http://schemas.microsoft.com/office/drawing/2016/5/9/chartex" xmlns:cx4="http://schemas.microsoft.com/office/drawing/2016/5/10/chartex" xmlns:cx5="http://schemas.microsoft.com/office/drawing/2016/5/11/chartex" xmlns:cx6="http://schemas.microsoft.com/office/drawing/2016/5/12/chartex" xmlns:cx7="http://schemas.microsoft.com/office/drawing/2016/5/13/chartex" xmlns:cx8="http://schemas.microsoft.com/office/drawing/2016/5/14/chartex" xmlns:mc="http://schemas.openxmlformats.org/markup-compatibility/2006" xmlns:aink="http://schemas.microsoft.com/office/drawing/2016/ink" xmlns:am3d="http://schemas.microsoft.com/office/drawing/2017/model3d" xmlns:o="urn:schemas-microsoft-com:office:office" xmlns:oel="http://schemas.microsoft.com/office/2019/extlst" xmlns:r="http://schemas.openxmlformats.org/officeDocument/2006/relationships" xmlns:m="http://schemas.openxmlformats.org/officeDocument/2006/math" xmlns:v="urn:schemas-microsoft-com:vml" xmlns:wp14="http://schemas.microsoft.com/office/word/2010/wordprocessingDrawing" xmlns:wp="http://schemas.openxmlformats.org/drawingml/2006/wordprocessingDrawing" xmlns:w10="urn:schemas-microsoft-com:office:word" xmlns:w="http://schemas.openxmlformats.org/wordprocessingml/2006/main" xmlns:w14="http://schemas.microsoft.com/office/word/2010/wordml" xmlns:w15="http://schemas.microsoft.com/office/word/2012/wordml" xmlns:w16cex="http://schemas.microsoft.com/office/word/2018/wordml/cex" xmlns:w16cid="http://schemas.microsoft.com/office/word/2016/wordml/cid" xmlns:w16="http://schemas.microsoft.com/office/word/2018/wordml" xmlns:w16du="http://schemas.microsoft.com/office/word/2023/wordml/word16du" xmlns:w16sdtdh="http://schemas.microsoft.com/office/word/2020/wordml/sdtdatahash" xmlns:w16sdtfl="http://schemas.microsoft.com/office/word/2024/wordml/sdtformatlock" xmlns:w16se="http://schemas.microsoft.com/office/word/2015/wordml/symex" xmlns:wpg="http://schemas.microsoft.com/office/word/2010/wordprocessingGroup" xmlns:wpi="http://schemas.microsoft.com/office/word/2010/wordprocessingInk" xmlns:wne="http://schemas.microsoft.com/office/word/2006/wordml" xmlns:wps="http://schemas.microsoft.com/office/word/2010/wordprocessingShape" mc:Ignorable="w14 w15 w16se w16cid w16 w16cex w16sdtdh w16sdtfl w16du wp14">
   <w:p>
     <w:pPr>
       <w:pStyle w:val="Header"/>
@@ -110,7 +166,7 @@
 </file>
 
 <file path=word/header2.xml><?xml version="1.0" encoding="utf-8"?>
-<w:hdr xmlns:wpc="http://schemas.microsoft.com/office/word/2010/wordprocessingCanvas" xmlns:cx="http://schemas.microsoft.com/office/drawing/2014/chartex" xmlns:cx1="http://schemas.microsoft.com/office/drawing/2015/9/8/chartex" xmlns:cx2="http://schemas.microsoft.com/office/drawing/2015/10/21/chartex" xmlns:cx3="http://schemas.microsoft.com/office/drawing/2016/5/9/chartex" xmlns:cx4="http://schemas.microsoft.com/office/drawing/2016/5/10/chartex" xmlns:cx5="http://schemas.microsoft.com/office/drawing/2016/5/11/chartex" xmlns:cx6="http://schemas.microsoft.com/office/drawing/2016/5/12/chartex" xmlns:cx7="http://schemas.microsoft.com/office/drawing/2016/5/13/chartex" xmlns:cx8="http://schemas.microsoft.com/office/drawing/2016/5/14/chartex" xmlns:mc="http://schemas.openxmlformats.org/markup-compatibility/2006" xmlns:aink="http://schemas.microsoft.com/office/drawing/2016/ink" xmlns:am3d="http://schemas.microsoft.com/office/drawing/2017/model3d" xmlns:o="urn:schemas-microsoft-com:office:office" xmlns:oel="http://schemas.microsoft.com/office/2019/extlst" xmlns:r="http://schemas.openxmlformats.org/officeDocument/2006/relationships" xmlns:m="http://schemas.openxmlformats.org/officeDocument/2006/math" xmlns:v="urn:schemas-microsoft-com:vml" xmlns:wp14="http://schemas.microsoft.com/office/word/2010/wordprocessingDrawing" xmlns:wp="http://schemas.openxmlformats.org/drawingml/2006/wordprocessingDrawing" xmlns:w10="urn:schemas-microsoft-com:office:word" xmlns:w="http://schemas.openxmlformats.org/wordprocessingml/2006/main" xmlns:w14="http://schemas.microsoft.com/office/word/2010/wordml" xmlns:w15="http://schemas.microsoft.com/office/word/2012/wordml" xmlns:w16cex="http://schemas.microsoft.com/office/word/2018/wordml/cex" xmlns:w16cid="http://schemas.microsoft.com/office/word/2016/wordml/cid" xmlns:w16="http://schemas.microsoft.com/office/word/2018/wordml" xmlns:w16sdtdh="http://schemas.microsoft.com/office/word/2020/wordml/sdtdatahash" xmlns:w16se="http://schemas.microsoft.com/office/word/2015/wordml/symex" xmlns:wpg="http://schemas.microsoft.com/office/word/2010/wordprocessingGroup" xmlns:wpi="http://schemas.microsoft.com/office/word/2010/wordprocessingInk" xmlns:wne="http://schemas.microsoft.com/office/word/2006/wordml" xmlns:wps="http://schemas.microsoft.com/office/word/2010/wordprocessingShape" mc:Ignorable="w14 w15 w16se w16cid w16 w16cex w16sdtdh wp14">
+<w:hdr xmlns:wpc="http://schemas.microsoft.com/office/word/2010/wordprocessingCanvas" xmlns:cx="http://schemas.microsoft.com/office/drawing/2014/chartex" xmlns:cx1="http://schemas.microsoft.com/office/drawing/2015/9/8/chartex" xmlns:cx2="http://schemas.microsoft.com/office/drawing/2015/10/21/chartex" xmlns:cx3="http://schemas.microsoft.com/office/drawing/2016/5/9/chartex" xmlns:cx4="http://schemas.microsoft.com/office/drawing/2016/5/10/chartex" xmlns:cx5="http://schemas.microsoft.com/office/drawing/2016/5/11/chartex" xmlns:cx6="http://schemas.microsoft.com/office/drawing/2016/5/12/chartex" xmlns:cx7="http://schemas.microsoft.com/office/drawing/2016/5/13/chartex" xmlns:cx8="http://schemas.microsoft.com/office/drawing/2016/5/14/chartex" xmlns:mc="http://schemas.openxmlformats.org/markup-compatibility/2006" xmlns:aink="http://schemas.microsoft.com/office/drawing/2016/ink" xmlns:am3d="http://schemas.microsoft.com/office/drawing/2017/model3d" xmlns:o="urn:schemas-microsoft-com:office:office" xmlns:oel="http://schemas.microsoft.com/office/2019/extlst" xmlns:r="http://schemas.openxmlformats.org/officeDocument/2006/relationships" xmlns:m="http://schemas.openxmlformats.org/officeDocument/2006/math" xmlns:v="urn:schemas-microsoft-com:vml" xmlns:wp14="http://schemas.microsoft.com/office/word/2010/wordprocessingDrawing" xmlns:wp="http://schemas.openxmlformats.org/drawingml/2006/wordprocessingDrawing" xmlns:w10="urn:schemas-microsoft-com:office:word" xmlns:w="http://schemas.openxmlformats.org/wordprocessingml/2006/main" xmlns:w14="http://schemas.microsoft.com/office/word/2010/wordml" xmlns:w15="http://schemas.microsoft.com/office/word/2012/wordml" xmlns:w16cex="http://schemas.microsoft.com/office/word/2018/wordml/cex" xmlns:w16cid="http://schemas.microsoft.com/office/word/2016/wordml/cid" xmlns:w16="http://schemas.microsoft.com/office/word/2018/wordml" xmlns:w16du="http://schemas.microsoft.com/office/word/2023/wordml/word16du" xmlns:w16sdtdh="http://schemas.microsoft.com/office/word/2020/wordml/sdtdatahash" xmlns:w16sdtfl="http://schemas.microsoft.com/office/word/2024/wordml/sdtformatlock" xmlns:w16se="http://schemas.microsoft.com/office/word/2015/wordml/symex" xmlns:wpg="http://schemas.microsoft.com/office/word/2010/wordprocessingGroup" xmlns:wpi="http://schemas.microsoft.com/office/word/2010/wordprocessingInk" xmlns:wne="http://schemas.microsoft.com/office/word/2006/wordml" xmlns:wps="http://schemas.microsoft.com/office/word/2010/wordprocessingShape" mc:Ignorable="w14 w15 w16se w16cid w16 w16cex w16sdtdh w16sdtfl w16du wp14">
   <w:p>
     <w:pPr>
       <w:pStyle w:val="Header"/>
@@ -122,14 +178,28 @@
       <w:rPr>
         <w:lang w:val="nl-NL"/>
       </w:rPr>
-      <w:t>My custom template</w:t>
+      <w:t xml:space="preserve">My </w:t>
+    </w:r>
+    <w:proofErr w:type="spellStart"/>
+    <w:r>
+      <w:rPr>
+        <w:lang w:val="nl-NL"/>
+      </w:rPr>
+      <w:t>custom</w:t>
+    </w:r>
+    <w:proofErr w:type="spellEnd"/>
+    <w:r>
+      <w:rPr>
+        <w:lang w:val="nl-NL"/>
+      </w:rPr>
+      <w:t xml:space="preserve"> template</w:t>
     </w:r>
   </w:p>
 </w:hdr>
 </file>
 
 <file path=word/header3.xml><?xml version="1.0" encoding="utf-8"?>
-<w:hdr xmlns:wpc="http://schemas.microsoft.com/office/word/2010/wordprocessingCanvas" xmlns:cx="http://schemas.microsoft.com/office/drawing/2014/chartex" xmlns:cx1="http://schemas.microsoft.com/office/drawing/2015/9/8/chartex" xmlns:cx2="http://schemas.microsoft.com/office/drawing/2015/10/21/chartex" xmlns:cx3="http://schemas.microsoft.com/office/drawing/2016/5/9/chartex" xmlns:cx4="http://schemas.microsoft.com/office/drawing/2016/5/10/chartex" xmlns:cx5="http://schemas.microsoft.com/office/drawing/2016/5/11/chartex" xmlns:cx6="http://schemas.microsoft.com/office/drawing/2016/5/12/chartex" xmlns:cx7="http://schemas.microsoft.com/office/drawing/2016/5/13/chartex" xmlns:cx8="http://schemas.microsoft.com/office/drawing/2016/5/14/chartex" xmlns:mc="http://schemas.openxmlformats.org/markup-compatibility/2006" xmlns:aink="http://schemas.microsoft.com/office/drawing/2016/ink" xmlns:am3d="http://schemas.microsoft.com/office/drawing/2017/model3d" xmlns:o="urn:schemas-microsoft-com:office:office" xmlns:oel="http://schemas.microsoft.com/office/2019/extlst" xmlns:r="http://schemas.openxmlformats.org/officeDocument/2006/relationships" xmlns:m="http://schemas.openxmlformats.org/officeDocument/2006/math" xmlns:v="urn:schemas-microsoft-com:vml" xmlns:wp14="http://schemas.microsoft.com/office/word/2010/wordprocessingDrawing" xmlns:wp="http://schemas.openxmlformats.org/drawingml/2006/wordprocessingDrawing" xmlns:w10="urn:schemas-microsoft-com:office:word" xmlns:w="http://schemas.openxmlformats.org/wordprocessingml/2006/main" xmlns:w14="http://schemas.microsoft.com/office/word/2010/wordml" xmlns:w15="http://schemas.microsoft.com/office/word/2012/wordml" xmlns:w16cex="http://schemas.microsoft.com/office/word/2018/wordml/cex" xmlns:w16cid="http://schemas.microsoft.com/office/word/2016/wordml/cid" xmlns:w16="http://schemas.microsoft.com/office/word/2018/wordml" xmlns:w16sdtdh="http://schemas.microsoft.com/office/word/2020/wordml/sdtdatahash" xmlns:w16se="http://schemas.microsoft.com/office/word/2015/wordml/symex" xmlns:wpg="http://schemas.microsoft.com/office/word/2010/wordprocessingGroup" xmlns:wpi="http://schemas.microsoft.com/office/word/2010/wordprocessingInk" xmlns:wne="http://schemas.microsoft.com/office/word/2006/wordml" xmlns:wps="http://schemas.microsoft.com/office/word/2010/wordprocessingShape" mc:Ignorable="w14 w15 w16se w16cid w16 w16cex w16sdtdh wp14">
+<w:hdr xmlns:wpc="http://schemas.microsoft.com/office/word/2010/wordprocessingCanvas" xmlns:cx="http://schemas.microsoft.com/office/drawing/2014/chartex" xmlns:cx1="http://schemas.microsoft.com/office/drawing/2015/9/8/chartex" xmlns:cx2="http://schemas.microsoft.com/office/drawing/2015/10/21/chartex" xmlns:cx3="http://schemas.microsoft.com/office/drawing/2016/5/9/chartex" xmlns:cx4="http://schemas.microsoft.com/office/drawing/2016/5/10/chartex" xmlns:cx5="http://schemas.microsoft.com/office/drawing/2016/5/11/chartex" xmlns:cx6="http://schemas.microsoft.com/office/drawing/2016/5/12/chartex" xmlns:cx7="http://schemas.microsoft.com/office/drawing/2016/5/13/chartex" xmlns:cx8="http://schemas.microsoft.com/office/drawing/2016/5/14/chartex" xmlns:mc="http://schemas.openxmlformats.org/markup-compatibility/2006" xmlns:aink="http://schemas.microsoft.com/office/drawing/2016/ink" xmlns:am3d="http://schemas.microsoft.com/office/drawing/2017/model3d" xmlns:o="urn:schemas-microsoft-com:office:office" xmlns:oel="http://schemas.microsoft.com/office/2019/extlst" xmlns:r="http://schemas.openxmlformats.org/officeDocument/2006/relationships" xmlns:m="http://schemas.openxmlformats.org/officeDocument/2006/math" xmlns:v="urn:schemas-microsoft-com:vml" xmlns:wp14="http://schemas.microsoft.com/office/word/2010/wordprocessingDrawing" xmlns:wp="http://schemas.openxmlformats.org/drawingml/2006/wordprocessingDrawing" xmlns:w10="urn:schemas-microsoft-com:office:word" xmlns:w="http://schemas.openxmlformats.org/wordprocessingml/2006/main" xmlns:w14="http://schemas.microsoft.com/office/word/2010/wordml" xmlns:w15="http://schemas.microsoft.com/office/word/2012/wordml" xmlns:w16cex="http://schemas.microsoft.com/office/word/2018/wordml/cex" xmlns:w16cid="http://schemas.microsoft.com/office/word/2016/wordml/cid" xmlns:w16="http://schemas.microsoft.com/office/word/2018/wordml" xmlns:w16du="http://schemas.microsoft.com/office/word/2023/wordml/word16du" xmlns:w16sdtdh="http://schemas.microsoft.com/office/word/2020/wordml/sdtdatahash" xmlns:w16sdtfl="http://schemas.microsoft.com/office/word/2024/wordml/sdtformatlock" xmlns:w16se="http://schemas.microsoft.com/office/word/2015/wordml/symex" xmlns:wpg="http://schemas.microsoft.com/office/word/2010/wordprocessingGroup" xmlns:wpi="http://schemas.microsoft.com/office/word/2010/wordprocessingInk" xmlns:wne="http://schemas.microsoft.com/office/word/2006/wordml" xmlns:wps="http://schemas.microsoft.com/office/word/2010/wordprocessingShape" mc:Ignorable="w14 w15 w16se w16cid w16 w16cex w16sdtdh w16sdtfl w16du wp14">
   <w:p>
     <w:pPr>
       <w:pStyle w:val="Header"/>
@@ -139,14 +209,14 @@
 </file>
 
 <file path=word/styles.xml><?xml version="1.0" encoding="utf-8"?>
-<w:styles xmlns:mc="http://schemas.openxmlformats.org/markup-compatibility/2006" xmlns:r="http://schemas.openxmlformats.org/officeDocument/2006/relationships" xmlns:w="http://schemas.openxmlformats.org/wordprocessingml/2006/main" xmlns:w14="http://schemas.microsoft.com/office/word/2010/wordml" xmlns:w15="http://schemas.microsoft.com/office/word/2012/wordml" xmlns:w16cex="http://schemas.microsoft.com/office/word/2018/wordml/cex" xmlns:w16cid="http://schemas.microsoft.com/office/word/2016/wordml/cid" xmlns:w16="http://schemas.microsoft.com/office/word/2018/wordml" xmlns:w16sdtdh="http://schemas.microsoft.com/office/word/2020/wordml/sdtdatahash" xmlns:w16se="http://schemas.microsoft.com/office/word/2015/wordml/symex" mc:Ignorable="w14 w15 w16se w16cid w16 w16cex w16sdtdh">
+<w:styles xmlns:mc="http://schemas.openxmlformats.org/markup-compatibility/2006" xmlns:r="http://schemas.openxmlformats.org/officeDocument/2006/relationships" xmlns:w="http://schemas.openxmlformats.org/wordprocessingml/2006/main" xmlns:w14="http://schemas.microsoft.com/office/word/2010/wordml" xmlns:w15="http://schemas.microsoft.com/office/word/2012/wordml" xmlns:w16cex="http://schemas.microsoft.com/office/word/2018/wordml/cex" xmlns:w16cid="http://schemas.microsoft.com/office/word/2016/wordml/cid" xmlns:w16="http://schemas.microsoft.com/office/word/2018/wordml" xmlns:w16du="http://schemas.microsoft.com/office/word/2023/wordml/word16du" xmlns:w16sdtdh="http://schemas.microsoft.com/office/word/2020/wordml/sdtdatahash" xmlns:w16sdtfl="http://schemas.microsoft.com/office/word/2024/wordml/sdtformatlock" xmlns:w16se="http://schemas.microsoft.com/office/word/2015/wordml/symex" mc:Ignorable="w14 w15 w16se w16cid w16 w16cex w16sdtdh w16sdtfl w16du">
   <w:docDefaults>
     <w:rPrDefault>
       <w:rPr>
         <w:rFonts w:asciiTheme="minorHAnsi" w:eastAsiaTheme="minorHAnsi" w:hAnsiTheme="minorHAnsi" w:cstheme="minorBidi"/>
         <w:sz w:val="24"/>
         <w:szCs w:val="24"/>
-        <w:lang w:val="en-NL" w:eastAsia="en-US" w:bidi="ar-SA"/>
+        <w:lang w:eastAsia="en-US" w:bidi="ar-SA"/>
       </w:rPr>
     </w:rPrDefault>
     <w:pPrDefault/>
@@ -650,6 +720,46 @@
       <w:lang w:val="it-IT" w:eastAsia="it-IT"/>
     </w:rPr>
   </w:style>
+  <w:style w:type="paragraph" w:styleId="FootnoteText">
+    <w:name w:val="footnote text"/>
+    <w:basedOn w:val="Normal"/>
+    <w:link w:val="FootnoteTextChar"/>
+    <w:uiPriority w:val="99"/>
+    <w:semiHidden/>
+    <w:unhideWhenUsed/>
+    <w:rsid w:val="009E1873"/>
+    <w:pPr>
+      <w:spacing w:after="0" w:line="240" w:lineRule="auto"/>
+    </w:pPr>
+    <w:rPr>
+      <w:sz w:val="20"/>
+      <w:szCs w:val="20"/>
+    </w:rPr>
+  </w:style>
+  <w:style w:type="character" w:customStyle="1" w:styleId="FootnoteTextChar">
+    <w:name w:val="Footnote Text Char"/>
+    <w:basedOn w:val="DefaultParagraphFont"/>
+    <w:link w:val="FootnoteText"/>
+    <w:uiPriority w:val="99"/>
+    <w:semiHidden/>
+    <w:rsid w:val="009E1873"/>
+    <w:rPr>
+      <w:sz w:val="20"/>
+      <w:szCs w:val="20"/>
+      <w:lang w:val="it-IT" w:eastAsia="it-IT"/>
+    </w:rPr>
+  </w:style>
+  <w:style w:type="character" w:styleId="FootnoteReference">
+    <w:name w:val="footnote reference"/>
+    <w:basedOn w:val="DefaultParagraphFont"/>
+    <w:uiPriority w:val="99"/>
+    <w:semiHidden/>
+    <w:unhideWhenUsed/>
+    <w:rsid w:val="009E1873"/>
+    <w:rPr>
+      <w:vertAlign w:val="superscript"/>
+    </w:rPr>
+  </w:style>
 </w:styles>
 </file>
 
@@ -946,4 +1056,16 @@
     </a:ext>
   </a:extLst>
 </a:theme>
+</file>
+
+<file path=customXml/item1.xml><?xml version="1.0" encoding="utf-8"?>
+<b:Sources xmlns:b="http://schemas.openxmlformats.org/officeDocument/2006/bibliography" xmlns="http://schemas.openxmlformats.org/officeDocument/2006/bibliography" SelectedStyle="/APASixthEditionOfficeOnline.xsl" StyleName="APA" Version="6"/>
+</file>
+
+<file path=customXml/itemProps1.xml><?xml version="1.0" encoding="utf-8"?>
+<ds:datastoreItem xmlns:ds="http://schemas.openxmlformats.org/officeDocument/2006/customXml" ds:itemID="{DC756D4C-F0A0-514D-A99B-A5D863ECD03C}">
+  <ds:schemaRefs>
+    <ds:schemaRef ds:uri="http://schemas.openxmlformats.org/officeDocument/2006/bibliography"/>
+  </ds:schemaRefs>
+</ds:datastoreItem>
 </file>
</xml_diff>

<commit_message>
Revert simple.docx file because it contained extra settings.
</commit_message>
<xml_diff>
--- a/test/simple.docx
+++ b/test/simple.docx
@@ -1,46 +1,15 @@
 
 <file path=word/document.xml><?xml version="1.0" encoding="utf-8"?>
-<w:document xmlns:wpc="http://schemas.microsoft.com/office/word/2010/wordprocessingCanvas" xmlns:cx="http://schemas.microsoft.com/office/drawing/2014/chartex" xmlns:cx1="http://schemas.microsoft.com/office/drawing/2015/9/8/chartex" xmlns:cx2="http://schemas.microsoft.com/office/drawing/2015/10/21/chartex" xmlns:cx3="http://schemas.microsoft.com/office/drawing/2016/5/9/chartex" xmlns:cx4="http://schemas.microsoft.com/office/drawing/2016/5/10/chartex" xmlns:cx5="http://schemas.microsoft.com/office/drawing/2016/5/11/chartex" xmlns:cx6="http://schemas.microsoft.com/office/drawing/2016/5/12/chartex" xmlns:cx7="http://schemas.microsoft.com/office/drawing/2016/5/13/chartex" xmlns:cx8="http://schemas.microsoft.com/office/drawing/2016/5/14/chartex" xmlns:mc="http://schemas.openxmlformats.org/markup-compatibility/2006" xmlns:aink="http://schemas.microsoft.com/office/drawing/2016/ink" xmlns:am3d="http://schemas.microsoft.com/office/drawing/2017/model3d" xmlns:o="urn:schemas-microsoft-com:office:office" xmlns:oel="http://schemas.microsoft.com/office/2019/extlst" xmlns:r="http://schemas.openxmlformats.org/officeDocument/2006/relationships" xmlns:m="http://schemas.openxmlformats.org/officeDocument/2006/math" xmlns:v="urn:schemas-microsoft-com:vml" xmlns:wp14="http://schemas.microsoft.com/office/word/2010/wordprocessingDrawing" xmlns:wp="http://schemas.openxmlformats.org/drawingml/2006/wordprocessingDrawing" xmlns:w10="urn:schemas-microsoft-com:office:word" xmlns:w="http://schemas.openxmlformats.org/wordprocessingml/2006/main" xmlns:w14="http://schemas.microsoft.com/office/word/2010/wordml" xmlns:w15="http://schemas.microsoft.com/office/word/2012/wordml" xmlns:w16cex="http://schemas.microsoft.com/office/word/2018/wordml/cex" xmlns:w16cid="http://schemas.microsoft.com/office/word/2016/wordml/cid" xmlns:w16="http://schemas.microsoft.com/office/word/2018/wordml" xmlns:w16du="http://schemas.microsoft.com/office/word/2023/wordml/word16du" xmlns:w16sdtdh="http://schemas.microsoft.com/office/word/2020/wordml/sdtdatahash" xmlns:w16sdtfl="http://schemas.microsoft.com/office/word/2024/wordml/sdtformatlock" xmlns:w16se="http://schemas.microsoft.com/office/word/2015/wordml/symex" xmlns:wpg="http://schemas.microsoft.com/office/word/2010/wordprocessingGroup" xmlns:wpi="http://schemas.microsoft.com/office/word/2010/wordprocessingInk" xmlns:wne="http://schemas.microsoft.com/office/word/2006/wordml" xmlns:wps="http://schemas.microsoft.com/office/word/2010/wordprocessingShape" mc:Ignorable="w14 w15 w16se w16cid w16 w16cex w16sdtdh w16sdtfl w16du wp14">
+<w:document xmlns:wpc="http://schemas.microsoft.com/office/word/2010/wordprocessingCanvas" xmlns:cx="http://schemas.microsoft.com/office/drawing/2014/chartex" xmlns:cx1="http://schemas.microsoft.com/office/drawing/2015/9/8/chartex" xmlns:cx2="http://schemas.microsoft.com/office/drawing/2015/10/21/chartex" xmlns:cx3="http://schemas.microsoft.com/office/drawing/2016/5/9/chartex" xmlns:cx4="http://schemas.microsoft.com/office/drawing/2016/5/10/chartex" xmlns:cx5="http://schemas.microsoft.com/office/drawing/2016/5/11/chartex" xmlns:cx6="http://schemas.microsoft.com/office/drawing/2016/5/12/chartex" xmlns:cx7="http://schemas.microsoft.com/office/drawing/2016/5/13/chartex" xmlns:cx8="http://schemas.microsoft.com/office/drawing/2016/5/14/chartex" xmlns:mc="http://schemas.openxmlformats.org/markup-compatibility/2006" xmlns:aink="http://schemas.microsoft.com/office/drawing/2016/ink" xmlns:am3d="http://schemas.microsoft.com/office/drawing/2017/model3d" xmlns:o="urn:schemas-microsoft-com:office:office" xmlns:oel="http://schemas.microsoft.com/office/2019/extlst" xmlns:r="http://schemas.openxmlformats.org/officeDocument/2006/relationships" xmlns:m="http://schemas.openxmlformats.org/officeDocument/2006/math" xmlns:v="urn:schemas-microsoft-com:vml" xmlns:wp14="http://schemas.microsoft.com/office/word/2010/wordprocessingDrawing" xmlns:wp="http://schemas.openxmlformats.org/drawingml/2006/wordprocessingDrawing" xmlns:w10="urn:schemas-microsoft-com:office:word" xmlns:w="http://schemas.openxmlformats.org/wordprocessingml/2006/main" xmlns:w14="http://schemas.microsoft.com/office/word/2010/wordml" xmlns:w15="http://schemas.microsoft.com/office/word/2012/wordml" xmlns:w16cex="http://schemas.microsoft.com/office/word/2018/wordml/cex" xmlns:w16cid="http://schemas.microsoft.com/office/word/2016/wordml/cid" xmlns:w16="http://schemas.microsoft.com/office/word/2018/wordml" xmlns:w16sdtdh="http://schemas.microsoft.com/office/word/2020/wordml/sdtdatahash" xmlns:w16se="http://schemas.microsoft.com/office/word/2015/wordml/symex" xmlns:wpg="http://schemas.microsoft.com/office/word/2010/wordprocessingGroup" xmlns:wpi="http://schemas.microsoft.com/office/word/2010/wordprocessingInk" xmlns:wne="http://schemas.microsoft.com/office/word/2006/wordml" xmlns:wps="http://schemas.microsoft.com/office/word/2010/wordprocessingShape" mc:Ignorable="w14 w15 w16se w16cid w16 w16cex w16sdtdh wp14">
   <w:body>
-    <w:p>
-      <w:proofErr w:type="spellStart"/>
-      <w:r>
-        <w:t>Adding</w:t>
-      </w:r>
-      <w:proofErr w:type="spellEnd"/>
-      <w:r>
-        <w:t xml:space="preserve"> a </w:t>
-      </w:r>
-      <w:proofErr w:type="spellStart"/>
-      <w:r>
-        <w:t>Footnote</w:t>
-      </w:r>
-      <w:proofErr w:type="spellEnd"/>
-      <w:r>
-        <w:t xml:space="preserve"> </w:t>
-      </w:r>
-      <w:proofErr w:type="spellStart"/>
-      <w:r>
-        <w:t>as</w:t>
-      </w:r>
-      <w:proofErr w:type="spellEnd"/>
-      <w:r>
-        <w:t xml:space="preserve"> a test.</w:t>
-      </w:r>
-      <w:r>
-        <w:rPr>
-          <w:rStyle w:val="FootnoteReference"/>
-        </w:rPr>
-        <w:footnoteReference w:id="1"/>
-      </w:r>
-    </w:p>
+    <w:p/>
     <w:sectPr>
-      <w:headerReference w:type="even" r:id="rId7"/>
-      <w:headerReference w:type="default" r:id="rId8"/>
-      <w:footerReference w:type="even" r:id="rId9"/>
-      <w:footerReference w:type="default" r:id="rId10"/>
-      <w:headerReference w:type="first" r:id="rId11"/>
-      <w:footerReference w:type="first" r:id="rId12"/>
+      <w:headerReference w:type="even" r:id="rId6"/>
+      <w:headerReference w:type="default" r:id="rId7"/>
+      <w:footerReference w:type="even" r:id="rId8"/>
+      <w:footerReference w:type="default" r:id="rId9"/>
+      <w:headerReference w:type="first" r:id="rId10"/>
+      <w:footerReference w:type="first" r:id="rId11"/>
       <w:pgSz w:w="11906" w:h="16838"/>
       <w:pgMar w:top="1440" w:right="1440" w:bottom="1440" w:left="1440" w:header="708" w:footer="708" w:gutter="0"/>
       <w:cols w:space="708"/>
@@ -51,7 +20,7 @@
 </file>
 
 <file path=word/endnotes.xml><?xml version="1.0" encoding="utf-8"?>
-<w:endnotes xmlns:wpc="http://schemas.microsoft.com/office/word/2010/wordprocessingCanvas" xmlns:cx="http://schemas.microsoft.com/office/drawing/2014/chartex" xmlns:cx1="http://schemas.microsoft.com/office/drawing/2015/9/8/chartex" xmlns:cx2="http://schemas.microsoft.com/office/drawing/2015/10/21/chartex" xmlns:cx3="http://schemas.microsoft.com/office/drawing/2016/5/9/chartex" xmlns:cx4="http://schemas.microsoft.com/office/drawing/2016/5/10/chartex" xmlns:cx5="http://schemas.microsoft.com/office/drawing/2016/5/11/chartex" xmlns:cx6="http://schemas.microsoft.com/office/drawing/2016/5/12/chartex" xmlns:cx7="http://schemas.microsoft.com/office/drawing/2016/5/13/chartex" xmlns:cx8="http://schemas.microsoft.com/office/drawing/2016/5/14/chartex" xmlns:mc="http://schemas.openxmlformats.org/markup-compatibility/2006" xmlns:aink="http://schemas.microsoft.com/office/drawing/2016/ink" xmlns:am3d="http://schemas.microsoft.com/office/drawing/2017/model3d" xmlns:o="urn:schemas-microsoft-com:office:office" xmlns:oel="http://schemas.microsoft.com/office/2019/extlst" xmlns:r="http://schemas.openxmlformats.org/officeDocument/2006/relationships" xmlns:m="http://schemas.openxmlformats.org/officeDocument/2006/math" xmlns:v="urn:schemas-microsoft-com:vml" xmlns:wp14="http://schemas.microsoft.com/office/word/2010/wordprocessingDrawing" xmlns:wp="http://schemas.openxmlformats.org/drawingml/2006/wordprocessingDrawing" xmlns:w10="urn:schemas-microsoft-com:office:word" xmlns:w="http://schemas.openxmlformats.org/wordprocessingml/2006/main" xmlns:w14="http://schemas.microsoft.com/office/word/2010/wordml" xmlns:w15="http://schemas.microsoft.com/office/word/2012/wordml" xmlns:w16cex="http://schemas.microsoft.com/office/word/2018/wordml/cex" xmlns:w16cid="http://schemas.microsoft.com/office/word/2016/wordml/cid" xmlns:w16="http://schemas.microsoft.com/office/word/2018/wordml" xmlns:w16du="http://schemas.microsoft.com/office/word/2023/wordml/word16du" xmlns:w16sdtdh="http://schemas.microsoft.com/office/word/2020/wordml/sdtdatahash" xmlns:w16sdtfl="http://schemas.microsoft.com/office/word/2024/wordml/sdtformatlock" xmlns:w16se="http://schemas.microsoft.com/office/word/2015/wordml/symex" xmlns:wpg="http://schemas.microsoft.com/office/word/2010/wordprocessingGroup" xmlns:wpi="http://schemas.microsoft.com/office/word/2010/wordprocessingInk" xmlns:wne="http://schemas.microsoft.com/office/word/2006/wordml" xmlns:wps="http://schemas.microsoft.com/office/word/2010/wordprocessingShape" mc:Ignorable="w14 w15 w16se w16cid w16 w16cex w16sdtdh w16sdtfl w16du wp14">
+<w:endnotes xmlns:wpc="http://schemas.microsoft.com/office/word/2010/wordprocessingCanvas" xmlns:cx="http://schemas.microsoft.com/office/drawing/2014/chartex" xmlns:cx1="http://schemas.microsoft.com/office/drawing/2015/9/8/chartex" xmlns:cx2="http://schemas.microsoft.com/office/drawing/2015/10/21/chartex" xmlns:cx3="http://schemas.microsoft.com/office/drawing/2016/5/9/chartex" xmlns:cx4="http://schemas.microsoft.com/office/drawing/2016/5/10/chartex" xmlns:cx5="http://schemas.microsoft.com/office/drawing/2016/5/11/chartex" xmlns:cx6="http://schemas.microsoft.com/office/drawing/2016/5/12/chartex" xmlns:cx7="http://schemas.microsoft.com/office/drawing/2016/5/13/chartex" xmlns:cx8="http://schemas.microsoft.com/office/drawing/2016/5/14/chartex" xmlns:mc="http://schemas.openxmlformats.org/markup-compatibility/2006" xmlns:aink="http://schemas.microsoft.com/office/drawing/2016/ink" xmlns:am3d="http://schemas.microsoft.com/office/drawing/2017/model3d" xmlns:o="urn:schemas-microsoft-com:office:office" xmlns:oel="http://schemas.microsoft.com/office/2019/extlst" xmlns:r="http://schemas.openxmlformats.org/officeDocument/2006/relationships" xmlns:m="http://schemas.openxmlformats.org/officeDocument/2006/math" xmlns:v="urn:schemas-microsoft-com:vml" xmlns:wp14="http://schemas.microsoft.com/office/word/2010/wordprocessingDrawing" xmlns:wp="http://schemas.openxmlformats.org/drawingml/2006/wordprocessingDrawing" xmlns:w10="urn:schemas-microsoft-com:office:word" xmlns:w="http://schemas.openxmlformats.org/wordprocessingml/2006/main" xmlns:w14="http://schemas.microsoft.com/office/word/2010/wordml" xmlns:w15="http://schemas.microsoft.com/office/word/2012/wordml" xmlns:w16cex="http://schemas.microsoft.com/office/word/2018/wordml/cex" xmlns:w16cid="http://schemas.microsoft.com/office/word/2016/wordml/cid" xmlns:w16="http://schemas.microsoft.com/office/word/2018/wordml" xmlns:w16sdtdh="http://schemas.microsoft.com/office/word/2020/wordml/sdtdatahash" xmlns:w16se="http://schemas.microsoft.com/office/word/2015/wordml/symex" xmlns:wpg="http://schemas.microsoft.com/office/word/2010/wordprocessingGroup" xmlns:wpi="http://schemas.microsoft.com/office/word/2010/wordprocessingInk" xmlns:wne="http://schemas.microsoft.com/office/word/2006/wordml" xmlns:wps="http://schemas.microsoft.com/office/word/2010/wordprocessingShape" mc:Ignorable="w14 w15 w16se w16cid w16 w16cex w16sdtdh wp14">
   <w:endnote w:type="separator" w:id="-1">
     <w:p>
       <w:pPr>
@@ -76,7 +45,7 @@
 </file>
 
 <file path=word/footer1.xml><?xml version="1.0" encoding="utf-8"?>
-<w:ftr xmlns:wpc="http://schemas.microsoft.com/office/word/2010/wordprocessingCanvas" xmlns:cx="http://schemas.microsoft.com/office/drawing/2014/chartex" xmlns:cx1="http://schemas.microsoft.com/office/drawing/2015/9/8/chartex" xmlns:cx2="http://schemas.microsoft.com/office/drawing/2015/10/21/chartex" xmlns:cx3="http://schemas.microsoft.com/office/drawing/2016/5/9/chartex" xmlns:cx4="http://schemas.microsoft.com/office/drawing/2016/5/10/chartex" xmlns:cx5="http://schemas.microsoft.com/office/drawing/2016/5/11/chartex" xmlns:cx6="http://schemas.microsoft.com/office/drawing/2016/5/12/chartex" xmlns:cx7="http://schemas.microsoft.com/office/drawing/2016/5/13/chartex" xmlns:cx8="http://schemas.microsoft.com/office/drawing/2016/5/14/chartex" xmlns:mc="http://schemas.openxmlformats.org/markup-compatibility/2006" xmlns:aink="http://schemas.microsoft.com/office/drawing/2016/ink" xmlns:am3d="http://schemas.microsoft.com/office/drawing/2017/model3d" xmlns:o="urn:schemas-microsoft-com:office:office" xmlns:oel="http://schemas.microsoft.com/office/2019/extlst" xmlns:r="http://schemas.openxmlformats.org/officeDocument/2006/relationships" xmlns:m="http://schemas.openxmlformats.org/officeDocument/2006/math" xmlns:v="urn:schemas-microsoft-com:vml" xmlns:wp14="http://schemas.microsoft.com/office/word/2010/wordprocessingDrawing" xmlns:wp="http://schemas.openxmlformats.org/drawingml/2006/wordprocessingDrawing" xmlns:w10="urn:schemas-microsoft-com:office:word" xmlns:w="http://schemas.openxmlformats.org/wordprocessingml/2006/main" xmlns:w14="http://schemas.microsoft.com/office/word/2010/wordml" xmlns:w15="http://schemas.microsoft.com/office/word/2012/wordml" xmlns:w16cex="http://schemas.microsoft.com/office/word/2018/wordml/cex" xmlns:w16cid="http://schemas.microsoft.com/office/word/2016/wordml/cid" xmlns:w16="http://schemas.microsoft.com/office/word/2018/wordml" xmlns:w16du="http://schemas.microsoft.com/office/word/2023/wordml/word16du" xmlns:w16sdtdh="http://schemas.microsoft.com/office/word/2020/wordml/sdtdatahash" xmlns:w16sdtfl="http://schemas.microsoft.com/office/word/2024/wordml/sdtformatlock" xmlns:w16se="http://schemas.microsoft.com/office/word/2015/wordml/symex" xmlns:wpg="http://schemas.microsoft.com/office/word/2010/wordprocessingGroup" xmlns:wpi="http://schemas.microsoft.com/office/word/2010/wordprocessingInk" xmlns:wne="http://schemas.microsoft.com/office/word/2006/wordml" xmlns:wps="http://schemas.microsoft.com/office/word/2010/wordprocessingShape" mc:Ignorable="w14 w15 w16se w16cid w16 w16cex w16sdtdh w16sdtfl w16du wp14">
+<w:ftr xmlns:wpc="http://schemas.microsoft.com/office/word/2010/wordprocessingCanvas" xmlns:cx="http://schemas.microsoft.com/office/drawing/2014/chartex" xmlns:cx1="http://schemas.microsoft.com/office/drawing/2015/9/8/chartex" xmlns:cx2="http://schemas.microsoft.com/office/drawing/2015/10/21/chartex" xmlns:cx3="http://schemas.microsoft.com/office/drawing/2016/5/9/chartex" xmlns:cx4="http://schemas.microsoft.com/office/drawing/2016/5/10/chartex" xmlns:cx5="http://schemas.microsoft.com/office/drawing/2016/5/11/chartex" xmlns:cx6="http://schemas.microsoft.com/office/drawing/2016/5/12/chartex" xmlns:cx7="http://schemas.microsoft.com/office/drawing/2016/5/13/chartex" xmlns:cx8="http://schemas.microsoft.com/office/drawing/2016/5/14/chartex" xmlns:mc="http://schemas.openxmlformats.org/markup-compatibility/2006" xmlns:aink="http://schemas.microsoft.com/office/drawing/2016/ink" xmlns:am3d="http://schemas.microsoft.com/office/drawing/2017/model3d" xmlns:o="urn:schemas-microsoft-com:office:office" xmlns:oel="http://schemas.microsoft.com/office/2019/extlst" xmlns:r="http://schemas.openxmlformats.org/officeDocument/2006/relationships" xmlns:m="http://schemas.openxmlformats.org/officeDocument/2006/math" xmlns:v="urn:schemas-microsoft-com:vml" xmlns:wp14="http://schemas.microsoft.com/office/word/2010/wordprocessingDrawing" xmlns:wp="http://schemas.openxmlformats.org/drawingml/2006/wordprocessingDrawing" xmlns:w10="urn:schemas-microsoft-com:office:word" xmlns:w="http://schemas.openxmlformats.org/wordprocessingml/2006/main" xmlns:w14="http://schemas.microsoft.com/office/word/2010/wordml" xmlns:w15="http://schemas.microsoft.com/office/word/2012/wordml" xmlns:w16cex="http://schemas.microsoft.com/office/word/2018/wordml/cex" xmlns:w16cid="http://schemas.microsoft.com/office/word/2016/wordml/cid" xmlns:w16="http://schemas.microsoft.com/office/word/2018/wordml" xmlns:w16sdtdh="http://schemas.microsoft.com/office/word/2020/wordml/sdtdatahash" xmlns:w16se="http://schemas.microsoft.com/office/word/2015/wordml/symex" xmlns:wpg="http://schemas.microsoft.com/office/word/2010/wordprocessingGroup" xmlns:wpi="http://schemas.microsoft.com/office/word/2010/wordprocessingInk" xmlns:wne="http://schemas.microsoft.com/office/word/2006/wordml" xmlns:wps="http://schemas.microsoft.com/office/word/2010/wordprocessingShape" mc:Ignorable="w14 w15 w16se w16cid w16 w16cex w16sdtdh wp14">
   <w:p>
     <w:pPr>
       <w:pStyle w:val="Footer"/>
@@ -86,7 +55,7 @@
 </file>
 
 <file path=word/footer2.xml><?xml version="1.0" encoding="utf-8"?>
-<w:ftr xmlns:wpc="http://schemas.microsoft.com/office/word/2010/wordprocessingCanvas" xmlns:cx="http://schemas.microsoft.com/office/drawing/2014/chartex" xmlns:cx1="http://schemas.microsoft.com/office/drawing/2015/9/8/chartex" xmlns:cx2="http://schemas.microsoft.com/office/drawing/2015/10/21/chartex" xmlns:cx3="http://schemas.microsoft.com/office/drawing/2016/5/9/chartex" xmlns:cx4="http://schemas.microsoft.com/office/drawing/2016/5/10/chartex" xmlns:cx5="http://schemas.microsoft.com/office/drawing/2016/5/11/chartex" xmlns:cx6="http://schemas.microsoft.com/office/drawing/2016/5/12/chartex" xmlns:cx7="http://schemas.microsoft.com/office/drawing/2016/5/13/chartex" xmlns:cx8="http://schemas.microsoft.com/office/drawing/2016/5/14/chartex" xmlns:mc="http://schemas.openxmlformats.org/markup-compatibility/2006" xmlns:aink="http://schemas.microsoft.com/office/drawing/2016/ink" xmlns:am3d="http://schemas.microsoft.com/office/drawing/2017/model3d" xmlns:o="urn:schemas-microsoft-com:office:office" xmlns:oel="http://schemas.microsoft.com/office/2019/extlst" xmlns:r="http://schemas.openxmlformats.org/officeDocument/2006/relationships" xmlns:m="http://schemas.openxmlformats.org/officeDocument/2006/math" xmlns:v="urn:schemas-microsoft-com:vml" xmlns:wp14="http://schemas.microsoft.com/office/word/2010/wordprocessingDrawing" xmlns:wp="http://schemas.openxmlformats.org/drawingml/2006/wordprocessingDrawing" xmlns:w10="urn:schemas-microsoft-com:office:word" xmlns:w="http://schemas.openxmlformats.org/wordprocessingml/2006/main" xmlns:w14="http://schemas.microsoft.com/office/word/2010/wordml" xmlns:w15="http://schemas.microsoft.com/office/word/2012/wordml" xmlns:w16cex="http://schemas.microsoft.com/office/word/2018/wordml/cex" xmlns:w16cid="http://schemas.microsoft.com/office/word/2016/wordml/cid" xmlns:w16="http://schemas.microsoft.com/office/word/2018/wordml" xmlns:w16du="http://schemas.microsoft.com/office/word/2023/wordml/word16du" xmlns:w16sdtdh="http://schemas.microsoft.com/office/word/2020/wordml/sdtdatahash" xmlns:w16sdtfl="http://schemas.microsoft.com/office/word/2024/wordml/sdtformatlock" xmlns:w16se="http://schemas.microsoft.com/office/word/2015/wordml/symex" xmlns:wpg="http://schemas.microsoft.com/office/word/2010/wordprocessingGroup" xmlns:wpi="http://schemas.microsoft.com/office/word/2010/wordprocessingInk" xmlns:wne="http://schemas.microsoft.com/office/word/2006/wordml" xmlns:wps="http://schemas.microsoft.com/office/word/2010/wordprocessingShape" mc:Ignorable="w14 w15 w16se w16cid w16 w16cex w16sdtdh w16sdtfl w16du wp14">
+<w:ftr xmlns:wpc="http://schemas.microsoft.com/office/word/2010/wordprocessingCanvas" xmlns:cx="http://schemas.microsoft.com/office/drawing/2014/chartex" xmlns:cx1="http://schemas.microsoft.com/office/drawing/2015/9/8/chartex" xmlns:cx2="http://schemas.microsoft.com/office/drawing/2015/10/21/chartex" xmlns:cx3="http://schemas.microsoft.com/office/drawing/2016/5/9/chartex" xmlns:cx4="http://schemas.microsoft.com/office/drawing/2016/5/10/chartex" xmlns:cx5="http://schemas.microsoft.com/office/drawing/2016/5/11/chartex" xmlns:cx6="http://schemas.microsoft.com/office/drawing/2016/5/12/chartex" xmlns:cx7="http://schemas.microsoft.com/office/drawing/2016/5/13/chartex" xmlns:cx8="http://schemas.microsoft.com/office/drawing/2016/5/14/chartex" xmlns:mc="http://schemas.openxmlformats.org/markup-compatibility/2006" xmlns:aink="http://schemas.microsoft.com/office/drawing/2016/ink" xmlns:am3d="http://schemas.microsoft.com/office/drawing/2017/model3d" xmlns:o="urn:schemas-microsoft-com:office:office" xmlns:oel="http://schemas.microsoft.com/office/2019/extlst" xmlns:r="http://schemas.openxmlformats.org/officeDocument/2006/relationships" xmlns:m="http://schemas.openxmlformats.org/officeDocument/2006/math" xmlns:v="urn:schemas-microsoft-com:vml" xmlns:wp14="http://schemas.microsoft.com/office/word/2010/wordprocessingDrawing" xmlns:wp="http://schemas.openxmlformats.org/drawingml/2006/wordprocessingDrawing" xmlns:w10="urn:schemas-microsoft-com:office:word" xmlns:w="http://schemas.openxmlformats.org/wordprocessingml/2006/main" xmlns:w14="http://schemas.microsoft.com/office/word/2010/wordml" xmlns:w15="http://schemas.microsoft.com/office/word/2012/wordml" xmlns:w16cex="http://schemas.microsoft.com/office/word/2018/wordml/cex" xmlns:w16cid="http://schemas.microsoft.com/office/word/2016/wordml/cid" xmlns:w16="http://schemas.microsoft.com/office/word/2018/wordml" xmlns:w16sdtdh="http://schemas.microsoft.com/office/word/2020/wordml/sdtdatahash" xmlns:w16se="http://schemas.microsoft.com/office/word/2015/wordml/symex" xmlns:wpg="http://schemas.microsoft.com/office/word/2010/wordprocessingGroup" xmlns:wpi="http://schemas.microsoft.com/office/word/2010/wordprocessingInk" xmlns:wne="http://schemas.microsoft.com/office/word/2006/wordml" xmlns:wps="http://schemas.microsoft.com/office/word/2010/wordprocessingShape" mc:Ignorable="w14 w15 w16se w16cid w16 w16cex w16sdtdh wp14">
   <w:p>
     <w:pPr>
       <w:pStyle w:val="Footer"/>
@@ -96,7 +65,7 @@
 </file>
 
 <file path=word/footer3.xml><?xml version="1.0" encoding="utf-8"?>
-<w:ftr xmlns:wpc="http://schemas.microsoft.com/office/word/2010/wordprocessingCanvas" xmlns:cx="http://schemas.microsoft.com/office/drawing/2014/chartex" xmlns:cx1="http://schemas.microsoft.com/office/drawing/2015/9/8/chartex" xmlns:cx2="http://schemas.microsoft.com/office/drawing/2015/10/21/chartex" xmlns:cx3="http://schemas.microsoft.com/office/drawing/2016/5/9/chartex" xmlns:cx4="http://schemas.microsoft.com/office/drawing/2016/5/10/chartex" xmlns:cx5="http://schemas.microsoft.com/office/drawing/2016/5/11/chartex" xmlns:cx6="http://schemas.microsoft.com/office/drawing/2016/5/12/chartex" xmlns:cx7="http://schemas.microsoft.com/office/drawing/2016/5/13/chartex" xmlns:cx8="http://schemas.microsoft.com/office/drawing/2016/5/14/chartex" xmlns:mc="http://schemas.openxmlformats.org/markup-compatibility/2006" xmlns:aink="http://schemas.microsoft.com/office/drawing/2016/ink" xmlns:am3d="http://schemas.microsoft.com/office/drawing/2017/model3d" xmlns:o="urn:schemas-microsoft-com:office:office" xmlns:oel="http://schemas.microsoft.com/office/2019/extlst" xmlns:r="http://schemas.openxmlformats.org/officeDocument/2006/relationships" xmlns:m="http://schemas.openxmlformats.org/officeDocument/2006/math" xmlns:v="urn:schemas-microsoft-com:vml" xmlns:wp14="http://schemas.microsoft.com/office/word/2010/wordprocessingDrawing" xmlns:wp="http://schemas.openxmlformats.org/drawingml/2006/wordprocessingDrawing" xmlns:w10="urn:schemas-microsoft-com:office:word" xmlns:w="http://schemas.openxmlformats.org/wordprocessingml/2006/main" xmlns:w14="http://schemas.microsoft.com/office/word/2010/wordml" xmlns:w15="http://schemas.microsoft.com/office/word/2012/wordml" xmlns:w16cex="http://schemas.microsoft.com/office/word/2018/wordml/cex" xmlns:w16cid="http://schemas.microsoft.com/office/word/2016/wordml/cid" xmlns:w16="http://schemas.microsoft.com/office/word/2018/wordml" xmlns:w16du="http://schemas.microsoft.com/office/word/2023/wordml/word16du" xmlns:w16sdtdh="http://schemas.microsoft.com/office/word/2020/wordml/sdtdatahash" xmlns:w16sdtfl="http://schemas.microsoft.com/office/word/2024/wordml/sdtformatlock" xmlns:w16se="http://schemas.microsoft.com/office/word/2015/wordml/symex" xmlns:wpg="http://schemas.microsoft.com/office/word/2010/wordprocessingGroup" xmlns:wpi="http://schemas.microsoft.com/office/word/2010/wordprocessingInk" xmlns:wne="http://schemas.microsoft.com/office/word/2006/wordml" xmlns:wps="http://schemas.microsoft.com/office/word/2010/wordprocessingShape" mc:Ignorable="w14 w15 w16se w16cid w16 w16cex w16sdtdh w16sdtfl w16du wp14">
+<w:ftr xmlns:wpc="http://schemas.microsoft.com/office/word/2010/wordprocessingCanvas" xmlns:cx="http://schemas.microsoft.com/office/drawing/2014/chartex" xmlns:cx1="http://schemas.microsoft.com/office/drawing/2015/9/8/chartex" xmlns:cx2="http://schemas.microsoft.com/office/drawing/2015/10/21/chartex" xmlns:cx3="http://schemas.microsoft.com/office/drawing/2016/5/9/chartex" xmlns:cx4="http://schemas.microsoft.com/office/drawing/2016/5/10/chartex" xmlns:cx5="http://schemas.microsoft.com/office/drawing/2016/5/11/chartex" xmlns:cx6="http://schemas.microsoft.com/office/drawing/2016/5/12/chartex" xmlns:cx7="http://schemas.microsoft.com/office/drawing/2016/5/13/chartex" xmlns:cx8="http://schemas.microsoft.com/office/drawing/2016/5/14/chartex" xmlns:mc="http://schemas.openxmlformats.org/markup-compatibility/2006" xmlns:aink="http://schemas.microsoft.com/office/drawing/2016/ink" xmlns:am3d="http://schemas.microsoft.com/office/drawing/2017/model3d" xmlns:o="urn:schemas-microsoft-com:office:office" xmlns:oel="http://schemas.microsoft.com/office/2019/extlst" xmlns:r="http://schemas.openxmlformats.org/officeDocument/2006/relationships" xmlns:m="http://schemas.openxmlformats.org/officeDocument/2006/math" xmlns:v="urn:schemas-microsoft-com:vml" xmlns:wp14="http://schemas.microsoft.com/office/word/2010/wordprocessingDrawing" xmlns:wp="http://schemas.openxmlformats.org/drawingml/2006/wordprocessingDrawing" xmlns:w10="urn:schemas-microsoft-com:office:word" xmlns:w="http://schemas.openxmlformats.org/wordprocessingml/2006/main" xmlns:w14="http://schemas.microsoft.com/office/word/2010/wordml" xmlns:w15="http://schemas.microsoft.com/office/word/2012/wordml" xmlns:w16cex="http://schemas.microsoft.com/office/word/2018/wordml/cex" xmlns:w16cid="http://schemas.microsoft.com/office/word/2016/wordml/cid" xmlns:w16="http://schemas.microsoft.com/office/word/2018/wordml" xmlns:w16sdtdh="http://schemas.microsoft.com/office/word/2020/wordml/sdtdatahash" xmlns:w16se="http://schemas.microsoft.com/office/word/2015/wordml/symex" xmlns:wpg="http://schemas.microsoft.com/office/word/2010/wordprocessingGroup" xmlns:wpi="http://schemas.microsoft.com/office/word/2010/wordprocessingInk" xmlns:wne="http://schemas.microsoft.com/office/word/2006/wordml" xmlns:wps="http://schemas.microsoft.com/office/word/2010/wordprocessingShape" mc:Ignorable="w14 w15 w16se w16cid w16 w16cex w16sdtdh wp14">
   <w:p>
     <w:pPr>
       <w:pStyle w:val="Footer"/>
@@ -106,7 +75,7 @@
 </file>
 
 <file path=word/footnotes.xml><?xml version="1.0" encoding="utf-8"?>
-<w:footnotes xmlns:wpc="http://schemas.microsoft.com/office/word/2010/wordprocessingCanvas" xmlns:cx="http://schemas.microsoft.com/office/drawing/2014/chartex" xmlns:cx1="http://schemas.microsoft.com/office/drawing/2015/9/8/chartex" xmlns:cx2="http://schemas.microsoft.com/office/drawing/2015/10/21/chartex" xmlns:cx3="http://schemas.microsoft.com/office/drawing/2016/5/9/chartex" xmlns:cx4="http://schemas.microsoft.com/office/drawing/2016/5/10/chartex" xmlns:cx5="http://schemas.microsoft.com/office/drawing/2016/5/11/chartex" xmlns:cx6="http://schemas.microsoft.com/office/drawing/2016/5/12/chartex" xmlns:cx7="http://schemas.microsoft.com/office/drawing/2016/5/13/chartex" xmlns:cx8="http://schemas.microsoft.com/office/drawing/2016/5/14/chartex" xmlns:mc="http://schemas.openxmlformats.org/markup-compatibility/2006" xmlns:aink="http://schemas.microsoft.com/office/drawing/2016/ink" xmlns:am3d="http://schemas.microsoft.com/office/drawing/2017/model3d" xmlns:o="urn:schemas-microsoft-com:office:office" xmlns:oel="http://schemas.microsoft.com/office/2019/extlst" xmlns:r="http://schemas.openxmlformats.org/officeDocument/2006/relationships" xmlns:m="http://schemas.openxmlformats.org/officeDocument/2006/math" xmlns:v="urn:schemas-microsoft-com:vml" xmlns:wp14="http://schemas.microsoft.com/office/word/2010/wordprocessingDrawing" xmlns:wp="http://schemas.openxmlformats.org/drawingml/2006/wordprocessingDrawing" xmlns:w10="urn:schemas-microsoft-com:office:word" xmlns:w="http://schemas.openxmlformats.org/wordprocessingml/2006/main" xmlns:w14="http://schemas.microsoft.com/office/word/2010/wordml" xmlns:w15="http://schemas.microsoft.com/office/word/2012/wordml" xmlns:w16cex="http://schemas.microsoft.com/office/word/2018/wordml/cex" xmlns:w16cid="http://schemas.microsoft.com/office/word/2016/wordml/cid" xmlns:w16="http://schemas.microsoft.com/office/word/2018/wordml" xmlns:w16du="http://schemas.microsoft.com/office/word/2023/wordml/word16du" xmlns:w16sdtdh="http://schemas.microsoft.com/office/word/2020/wordml/sdtdatahash" xmlns:w16sdtfl="http://schemas.microsoft.com/office/word/2024/wordml/sdtformatlock" xmlns:w16se="http://schemas.microsoft.com/office/word/2015/wordml/symex" xmlns:wpg="http://schemas.microsoft.com/office/word/2010/wordprocessingGroup" xmlns:wpi="http://schemas.microsoft.com/office/word/2010/wordprocessingInk" xmlns:wne="http://schemas.microsoft.com/office/word/2006/wordml" xmlns:wps="http://schemas.microsoft.com/office/word/2010/wordprocessingShape" mc:Ignorable="w14 w15 w16se w16cid w16 w16cex w16sdtdh w16sdtfl w16du wp14">
+<w:footnotes xmlns:wpc="http://schemas.microsoft.com/office/word/2010/wordprocessingCanvas" xmlns:cx="http://schemas.microsoft.com/office/drawing/2014/chartex" xmlns:cx1="http://schemas.microsoft.com/office/drawing/2015/9/8/chartex" xmlns:cx2="http://schemas.microsoft.com/office/drawing/2015/10/21/chartex" xmlns:cx3="http://schemas.microsoft.com/office/drawing/2016/5/9/chartex" xmlns:cx4="http://schemas.microsoft.com/office/drawing/2016/5/10/chartex" xmlns:cx5="http://schemas.microsoft.com/office/drawing/2016/5/11/chartex" xmlns:cx6="http://schemas.microsoft.com/office/drawing/2016/5/12/chartex" xmlns:cx7="http://schemas.microsoft.com/office/drawing/2016/5/13/chartex" xmlns:cx8="http://schemas.microsoft.com/office/drawing/2016/5/14/chartex" xmlns:mc="http://schemas.openxmlformats.org/markup-compatibility/2006" xmlns:aink="http://schemas.microsoft.com/office/drawing/2016/ink" xmlns:am3d="http://schemas.microsoft.com/office/drawing/2017/model3d" xmlns:o="urn:schemas-microsoft-com:office:office" xmlns:oel="http://schemas.microsoft.com/office/2019/extlst" xmlns:r="http://schemas.openxmlformats.org/officeDocument/2006/relationships" xmlns:m="http://schemas.openxmlformats.org/officeDocument/2006/math" xmlns:v="urn:schemas-microsoft-com:vml" xmlns:wp14="http://schemas.microsoft.com/office/word/2010/wordprocessingDrawing" xmlns:wp="http://schemas.openxmlformats.org/drawingml/2006/wordprocessingDrawing" xmlns:w10="urn:schemas-microsoft-com:office:word" xmlns:w="http://schemas.openxmlformats.org/wordprocessingml/2006/main" xmlns:w14="http://schemas.microsoft.com/office/word/2010/wordml" xmlns:w15="http://schemas.microsoft.com/office/word/2012/wordml" xmlns:w16cex="http://schemas.microsoft.com/office/word/2018/wordml/cex" xmlns:w16cid="http://schemas.microsoft.com/office/word/2016/wordml/cid" xmlns:w16="http://schemas.microsoft.com/office/word/2018/wordml" xmlns:w16sdtdh="http://schemas.microsoft.com/office/word/2020/wordml/sdtdatahash" xmlns:w16se="http://schemas.microsoft.com/office/word/2015/wordml/symex" xmlns:wpg="http://schemas.microsoft.com/office/word/2010/wordprocessingGroup" xmlns:wpi="http://schemas.microsoft.com/office/word/2010/wordprocessingInk" xmlns:wne="http://schemas.microsoft.com/office/word/2006/wordml" xmlns:wps="http://schemas.microsoft.com/office/word/2010/wordprocessingShape" mc:Ignorable="w14 w15 w16se w16cid w16 w16cex w16sdtdh wp14">
   <w:footnote w:type="separator" w:id="-1">
     <w:p>
       <w:pPr>
@@ -127,36 +96,11 @@
       </w:r>
     </w:p>
   </w:footnote>
-  <w:footnote w:id="1">
-    <w:p>
-      <w:pPr>
-        <w:pStyle w:val="FootnoteText"/>
-        <w:rPr>
-          <w:lang w:val="en-US"/>
-        </w:rPr>
-      </w:pPr>
-      <w:r>
-        <w:rPr>
-          <w:rStyle w:val="FootnoteReference"/>
-        </w:rPr>
-        <w:footnoteRef/>
-      </w:r>
-      <w:r>
-        <w:t xml:space="preserve"> </w:t>
-      </w:r>
-      <w:r>
-        <w:rPr>
-          <w:lang w:val="en-US"/>
-        </w:rPr>
-        <w:t>Footnote One.</w:t>
-      </w:r>
-    </w:p>
-  </w:footnote>
 </w:footnotes>
 </file>
 
 <file path=word/header1.xml><?xml version="1.0" encoding="utf-8"?>
-<w:hdr xmlns:wpc="http://schemas.microsoft.com/office/word/2010/wordprocessingCanvas" xmlns:cx="http://schemas.microsoft.com/office/drawing/2014/chartex" xmlns:cx1="http://schemas.microsoft.com/office/drawing/2015/9/8/chartex" xmlns:cx2="http://schemas.microsoft.com/office/drawing/2015/10/21/chartex" xmlns:cx3="http://schemas.microsoft.com/office/drawing/2016/5/9/chartex" xmlns:cx4="http://schemas.microsoft.com/office/drawing/2016/5/10/chartex" xmlns:cx5="http://schemas.microsoft.com/office/drawing/2016/5/11/chartex" xmlns:cx6="http://schemas.microsoft.com/office/drawing/2016/5/12/chartex" xmlns:cx7="http://schemas.microsoft.com/office/drawing/2016/5/13/chartex" xmlns:cx8="http://schemas.microsoft.com/office/drawing/2016/5/14/chartex" xmlns:mc="http://schemas.openxmlformats.org/markup-compatibility/2006" xmlns:aink="http://schemas.microsoft.com/office/drawing/2016/ink" xmlns:am3d="http://schemas.microsoft.com/office/drawing/2017/model3d" xmlns:o="urn:schemas-microsoft-com:office:office" xmlns:oel="http://schemas.microsoft.com/office/2019/extlst" xmlns:r="http://schemas.openxmlformats.org/officeDocument/2006/relationships" xmlns:m="http://schemas.openxmlformats.org/officeDocument/2006/math" xmlns:v="urn:schemas-microsoft-com:vml" xmlns:wp14="http://schemas.microsoft.com/office/word/2010/wordprocessingDrawing" xmlns:wp="http://schemas.openxmlformats.org/drawingml/2006/wordprocessingDrawing" xmlns:w10="urn:schemas-microsoft-com:office:word" xmlns:w="http://schemas.openxmlformats.org/wordprocessingml/2006/main" xmlns:w14="http://schemas.microsoft.com/office/word/2010/wordml" xmlns:w15="http://schemas.microsoft.com/office/word/2012/wordml" xmlns:w16cex="http://schemas.microsoft.com/office/word/2018/wordml/cex" xmlns:w16cid="http://schemas.microsoft.com/office/word/2016/wordml/cid" xmlns:w16="http://schemas.microsoft.com/office/word/2018/wordml" xmlns:w16du="http://schemas.microsoft.com/office/word/2023/wordml/word16du" xmlns:w16sdtdh="http://schemas.microsoft.com/office/word/2020/wordml/sdtdatahash" xmlns:w16sdtfl="http://schemas.microsoft.com/office/word/2024/wordml/sdtformatlock" xmlns:w16se="http://schemas.microsoft.com/office/word/2015/wordml/symex" xmlns:wpg="http://schemas.microsoft.com/office/word/2010/wordprocessingGroup" xmlns:wpi="http://schemas.microsoft.com/office/word/2010/wordprocessingInk" xmlns:wne="http://schemas.microsoft.com/office/word/2006/wordml" xmlns:wps="http://schemas.microsoft.com/office/word/2010/wordprocessingShape" mc:Ignorable="w14 w15 w16se w16cid w16 w16cex w16sdtdh w16sdtfl w16du wp14">
+<w:hdr xmlns:wpc="http://schemas.microsoft.com/office/word/2010/wordprocessingCanvas" xmlns:cx="http://schemas.microsoft.com/office/drawing/2014/chartex" xmlns:cx1="http://schemas.microsoft.com/office/drawing/2015/9/8/chartex" xmlns:cx2="http://schemas.microsoft.com/office/drawing/2015/10/21/chartex" xmlns:cx3="http://schemas.microsoft.com/office/drawing/2016/5/9/chartex" xmlns:cx4="http://schemas.microsoft.com/office/drawing/2016/5/10/chartex" xmlns:cx5="http://schemas.microsoft.com/office/drawing/2016/5/11/chartex" xmlns:cx6="http://schemas.microsoft.com/office/drawing/2016/5/12/chartex" xmlns:cx7="http://schemas.microsoft.com/office/drawing/2016/5/13/chartex" xmlns:cx8="http://schemas.microsoft.com/office/drawing/2016/5/14/chartex" xmlns:mc="http://schemas.openxmlformats.org/markup-compatibility/2006" xmlns:aink="http://schemas.microsoft.com/office/drawing/2016/ink" xmlns:am3d="http://schemas.microsoft.com/office/drawing/2017/model3d" xmlns:o="urn:schemas-microsoft-com:office:office" xmlns:oel="http://schemas.microsoft.com/office/2019/extlst" xmlns:r="http://schemas.openxmlformats.org/officeDocument/2006/relationships" xmlns:m="http://schemas.openxmlformats.org/officeDocument/2006/math" xmlns:v="urn:schemas-microsoft-com:vml" xmlns:wp14="http://schemas.microsoft.com/office/word/2010/wordprocessingDrawing" xmlns:wp="http://schemas.openxmlformats.org/drawingml/2006/wordprocessingDrawing" xmlns:w10="urn:schemas-microsoft-com:office:word" xmlns:w="http://schemas.openxmlformats.org/wordprocessingml/2006/main" xmlns:w14="http://schemas.microsoft.com/office/word/2010/wordml" xmlns:w15="http://schemas.microsoft.com/office/word/2012/wordml" xmlns:w16cex="http://schemas.microsoft.com/office/word/2018/wordml/cex" xmlns:w16cid="http://schemas.microsoft.com/office/word/2016/wordml/cid" xmlns:w16="http://schemas.microsoft.com/office/word/2018/wordml" xmlns:w16sdtdh="http://schemas.microsoft.com/office/word/2020/wordml/sdtdatahash" xmlns:w16se="http://schemas.microsoft.com/office/word/2015/wordml/symex" xmlns:wpg="http://schemas.microsoft.com/office/word/2010/wordprocessingGroup" xmlns:wpi="http://schemas.microsoft.com/office/word/2010/wordprocessingInk" xmlns:wne="http://schemas.microsoft.com/office/word/2006/wordml" xmlns:wps="http://schemas.microsoft.com/office/word/2010/wordprocessingShape" mc:Ignorable="w14 w15 w16se w16cid w16 w16cex w16sdtdh wp14">
   <w:p>
     <w:pPr>
       <w:pStyle w:val="Header"/>
@@ -166,7 +110,7 @@
 </file>
 
 <file path=word/header2.xml><?xml version="1.0" encoding="utf-8"?>
-<w:hdr xmlns:wpc="http://schemas.microsoft.com/office/word/2010/wordprocessingCanvas" xmlns:cx="http://schemas.microsoft.com/office/drawing/2014/chartex" xmlns:cx1="http://schemas.microsoft.com/office/drawing/2015/9/8/chartex" xmlns:cx2="http://schemas.microsoft.com/office/drawing/2015/10/21/chartex" xmlns:cx3="http://schemas.microsoft.com/office/drawing/2016/5/9/chartex" xmlns:cx4="http://schemas.microsoft.com/office/drawing/2016/5/10/chartex" xmlns:cx5="http://schemas.microsoft.com/office/drawing/2016/5/11/chartex" xmlns:cx6="http://schemas.microsoft.com/office/drawing/2016/5/12/chartex" xmlns:cx7="http://schemas.microsoft.com/office/drawing/2016/5/13/chartex" xmlns:cx8="http://schemas.microsoft.com/office/drawing/2016/5/14/chartex" xmlns:mc="http://schemas.openxmlformats.org/markup-compatibility/2006" xmlns:aink="http://schemas.microsoft.com/office/drawing/2016/ink" xmlns:am3d="http://schemas.microsoft.com/office/drawing/2017/model3d" xmlns:o="urn:schemas-microsoft-com:office:office" xmlns:oel="http://schemas.microsoft.com/office/2019/extlst" xmlns:r="http://schemas.openxmlformats.org/officeDocument/2006/relationships" xmlns:m="http://schemas.openxmlformats.org/officeDocument/2006/math" xmlns:v="urn:schemas-microsoft-com:vml" xmlns:wp14="http://schemas.microsoft.com/office/word/2010/wordprocessingDrawing" xmlns:wp="http://schemas.openxmlformats.org/drawingml/2006/wordprocessingDrawing" xmlns:w10="urn:schemas-microsoft-com:office:word" xmlns:w="http://schemas.openxmlformats.org/wordprocessingml/2006/main" xmlns:w14="http://schemas.microsoft.com/office/word/2010/wordml" xmlns:w15="http://schemas.microsoft.com/office/word/2012/wordml" xmlns:w16cex="http://schemas.microsoft.com/office/word/2018/wordml/cex" xmlns:w16cid="http://schemas.microsoft.com/office/word/2016/wordml/cid" xmlns:w16="http://schemas.microsoft.com/office/word/2018/wordml" xmlns:w16du="http://schemas.microsoft.com/office/word/2023/wordml/word16du" xmlns:w16sdtdh="http://schemas.microsoft.com/office/word/2020/wordml/sdtdatahash" xmlns:w16sdtfl="http://schemas.microsoft.com/office/word/2024/wordml/sdtformatlock" xmlns:w16se="http://schemas.microsoft.com/office/word/2015/wordml/symex" xmlns:wpg="http://schemas.microsoft.com/office/word/2010/wordprocessingGroup" xmlns:wpi="http://schemas.microsoft.com/office/word/2010/wordprocessingInk" xmlns:wne="http://schemas.microsoft.com/office/word/2006/wordml" xmlns:wps="http://schemas.microsoft.com/office/word/2010/wordprocessingShape" mc:Ignorable="w14 w15 w16se w16cid w16 w16cex w16sdtdh w16sdtfl w16du wp14">
+<w:hdr xmlns:wpc="http://schemas.microsoft.com/office/word/2010/wordprocessingCanvas" xmlns:cx="http://schemas.microsoft.com/office/drawing/2014/chartex" xmlns:cx1="http://schemas.microsoft.com/office/drawing/2015/9/8/chartex" xmlns:cx2="http://schemas.microsoft.com/office/drawing/2015/10/21/chartex" xmlns:cx3="http://schemas.microsoft.com/office/drawing/2016/5/9/chartex" xmlns:cx4="http://schemas.microsoft.com/office/drawing/2016/5/10/chartex" xmlns:cx5="http://schemas.microsoft.com/office/drawing/2016/5/11/chartex" xmlns:cx6="http://schemas.microsoft.com/office/drawing/2016/5/12/chartex" xmlns:cx7="http://schemas.microsoft.com/office/drawing/2016/5/13/chartex" xmlns:cx8="http://schemas.microsoft.com/office/drawing/2016/5/14/chartex" xmlns:mc="http://schemas.openxmlformats.org/markup-compatibility/2006" xmlns:aink="http://schemas.microsoft.com/office/drawing/2016/ink" xmlns:am3d="http://schemas.microsoft.com/office/drawing/2017/model3d" xmlns:o="urn:schemas-microsoft-com:office:office" xmlns:oel="http://schemas.microsoft.com/office/2019/extlst" xmlns:r="http://schemas.openxmlformats.org/officeDocument/2006/relationships" xmlns:m="http://schemas.openxmlformats.org/officeDocument/2006/math" xmlns:v="urn:schemas-microsoft-com:vml" xmlns:wp14="http://schemas.microsoft.com/office/word/2010/wordprocessingDrawing" xmlns:wp="http://schemas.openxmlformats.org/drawingml/2006/wordprocessingDrawing" xmlns:w10="urn:schemas-microsoft-com:office:word" xmlns:w="http://schemas.openxmlformats.org/wordprocessingml/2006/main" xmlns:w14="http://schemas.microsoft.com/office/word/2010/wordml" xmlns:w15="http://schemas.microsoft.com/office/word/2012/wordml" xmlns:w16cex="http://schemas.microsoft.com/office/word/2018/wordml/cex" xmlns:w16cid="http://schemas.microsoft.com/office/word/2016/wordml/cid" xmlns:w16="http://schemas.microsoft.com/office/word/2018/wordml" xmlns:w16sdtdh="http://schemas.microsoft.com/office/word/2020/wordml/sdtdatahash" xmlns:w16se="http://schemas.microsoft.com/office/word/2015/wordml/symex" xmlns:wpg="http://schemas.microsoft.com/office/word/2010/wordprocessingGroup" xmlns:wpi="http://schemas.microsoft.com/office/word/2010/wordprocessingInk" xmlns:wne="http://schemas.microsoft.com/office/word/2006/wordml" xmlns:wps="http://schemas.microsoft.com/office/word/2010/wordprocessingShape" mc:Ignorable="w14 w15 w16se w16cid w16 w16cex w16sdtdh wp14">
   <w:p>
     <w:pPr>
       <w:pStyle w:val="Header"/>
@@ -178,28 +122,14 @@
       <w:rPr>
         <w:lang w:val="nl-NL"/>
       </w:rPr>
-      <w:t xml:space="preserve">My </w:t>
-    </w:r>
-    <w:proofErr w:type="spellStart"/>
-    <w:r>
-      <w:rPr>
-        <w:lang w:val="nl-NL"/>
-      </w:rPr>
-      <w:t>custom</w:t>
-    </w:r>
-    <w:proofErr w:type="spellEnd"/>
-    <w:r>
-      <w:rPr>
-        <w:lang w:val="nl-NL"/>
-      </w:rPr>
-      <w:t xml:space="preserve"> template</w:t>
+      <w:t>My custom template</w:t>
     </w:r>
   </w:p>
 </w:hdr>
 </file>
 
 <file path=word/header3.xml><?xml version="1.0" encoding="utf-8"?>
-<w:hdr xmlns:wpc="http://schemas.microsoft.com/office/word/2010/wordprocessingCanvas" xmlns:cx="http://schemas.microsoft.com/office/drawing/2014/chartex" xmlns:cx1="http://schemas.microsoft.com/office/drawing/2015/9/8/chartex" xmlns:cx2="http://schemas.microsoft.com/office/drawing/2015/10/21/chartex" xmlns:cx3="http://schemas.microsoft.com/office/drawing/2016/5/9/chartex" xmlns:cx4="http://schemas.microsoft.com/office/drawing/2016/5/10/chartex" xmlns:cx5="http://schemas.microsoft.com/office/drawing/2016/5/11/chartex" xmlns:cx6="http://schemas.microsoft.com/office/drawing/2016/5/12/chartex" xmlns:cx7="http://schemas.microsoft.com/office/drawing/2016/5/13/chartex" xmlns:cx8="http://schemas.microsoft.com/office/drawing/2016/5/14/chartex" xmlns:mc="http://schemas.openxmlformats.org/markup-compatibility/2006" xmlns:aink="http://schemas.microsoft.com/office/drawing/2016/ink" xmlns:am3d="http://schemas.microsoft.com/office/drawing/2017/model3d" xmlns:o="urn:schemas-microsoft-com:office:office" xmlns:oel="http://schemas.microsoft.com/office/2019/extlst" xmlns:r="http://schemas.openxmlformats.org/officeDocument/2006/relationships" xmlns:m="http://schemas.openxmlformats.org/officeDocument/2006/math" xmlns:v="urn:schemas-microsoft-com:vml" xmlns:wp14="http://schemas.microsoft.com/office/word/2010/wordprocessingDrawing" xmlns:wp="http://schemas.openxmlformats.org/drawingml/2006/wordprocessingDrawing" xmlns:w10="urn:schemas-microsoft-com:office:word" xmlns:w="http://schemas.openxmlformats.org/wordprocessingml/2006/main" xmlns:w14="http://schemas.microsoft.com/office/word/2010/wordml" xmlns:w15="http://schemas.microsoft.com/office/word/2012/wordml" xmlns:w16cex="http://schemas.microsoft.com/office/word/2018/wordml/cex" xmlns:w16cid="http://schemas.microsoft.com/office/word/2016/wordml/cid" xmlns:w16="http://schemas.microsoft.com/office/word/2018/wordml" xmlns:w16du="http://schemas.microsoft.com/office/word/2023/wordml/word16du" xmlns:w16sdtdh="http://schemas.microsoft.com/office/word/2020/wordml/sdtdatahash" xmlns:w16sdtfl="http://schemas.microsoft.com/office/word/2024/wordml/sdtformatlock" xmlns:w16se="http://schemas.microsoft.com/office/word/2015/wordml/symex" xmlns:wpg="http://schemas.microsoft.com/office/word/2010/wordprocessingGroup" xmlns:wpi="http://schemas.microsoft.com/office/word/2010/wordprocessingInk" xmlns:wne="http://schemas.microsoft.com/office/word/2006/wordml" xmlns:wps="http://schemas.microsoft.com/office/word/2010/wordprocessingShape" mc:Ignorable="w14 w15 w16se w16cid w16 w16cex w16sdtdh w16sdtfl w16du wp14">
+<w:hdr xmlns:wpc="http://schemas.microsoft.com/office/word/2010/wordprocessingCanvas" xmlns:cx="http://schemas.microsoft.com/office/drawing/2014/chartex" xmlns:cx1="http://schemas.microsoft.com/office/drawing/2015/9/8/chartex" xmlns:cx2="http://schemas.microsoft.com/office/drawing/2015/10/21/chartex" xmlns:cx3="http://schemas.microsoft.com/office/drawing/2016/5/9/chartex" xmlns:cx4="http://schemas.microsoft.com/office/drawing/2016/5/10/chartex" xmlns:cx5="http://schemas.microsoft.com/office/drawing/2016/5/11/chartex" xmlns:cx6="http://schemas.microsoft.com/office/drawing/2016/5/12/chartex" xmlns:cx7="http://schemas.microsoft.com/office/drawing/2016/5/13/chartex" xmlns:cx8="http://schemas.microsoft.com/office/drawing/2016/5/14/chartex" xmlns:mc="http://schemas.openxmlformats.org/markup-compatibility/2006" xmlns:aink="http://schemas.microsoft.com/office/drawing/2016/ink" xmlns:am3d="http://schemas.microsoft.com/office/drawing/2017/model3d" xmlns:o="urn:schemas-microsoft-com:office:office" xmlns:oel="http://schemas.microsoft.com/office/2019/extlst" xmlns:r="http://schemas.openxmlformats.org/officeDocument/2006/relationships" xmlns:m="http://schemas.openxmlformats.org/officeDocument/2006/math" xmlns:v="urn:schemas-microsoft-com:vml" xmlns:wp14="http://schemas.microsoft.com/office/word/2010/wordprocessingDrawing" xmlns:wp="http://schemas.openxmlformats.org/drawingml/2006/wordprocessingDrawing" xmlns:w10="urn:schemas-microsoft-com:office:word" xmlns:w="http://schemas.openxmlformats.org/wordprocessingml/2006/main" xmlns:w14="http://schemas.microsoft.com/office/word/2010/wordml" xmlns:w15="http://schemas.microsoft.com/office/word/2012/wordml" xmlns:w16cex="http://schemas.microsoft.com/office/word/2018/wordml/cex" xmlns:w16cid="http://schemas.microsoft.com/office/word/2016/wordml/cid" xmlns:w16="http://schemas.microsoft.com/office/word/2018/wordml" xmlns:w16sdtdh="http://schemas.microsoft.com/office/word/2020/wordml/sdtdatahash" xmlns:w16se="http://schemas.microsoft.com/office/word/2015/wordml/symex" xmlns:wpg="http://schemas.microsoft.com/office/word/2010/wordprocessingGroup" xmlns:wpi="http://schemas.microsoft.com/office/word/2010/wordprocessingInk" xmlns:wne="http://schemas.microsoft.com/office/word/2006/wordml" xmlns:wps="http://schemas.microsoft.com/office/word/2010/wordprocessingShape" mc:Ignorable="w14 w15 w16se w16cid w16 w16cex w16sdtdh wp14">
   <w:p>
     <w:pPr>
       <w:pStyle w:val="Header"/>
@@ -209,14 +139,14 @@
 </file>
 
 <file path=word/styles.xml><?xml version="1.0" encoding="utf-8"?>
-<w:styles xmlns:mc="http://schemas.openxmlformats.org/markup-compatibility/2006" xmlns:r="http://schemas.openxmlformats.org/officeDocument/2006/relationships" xmlns:w="http://schemas.openxmlformats.org/wordprocessingml/2006/main" xmlns:w14="http://schemas.microsoft.com/office/word/2010/wordml" xmlns:w15="http://schemas.microsoft.com/office/word/2012/wordml" xmlns:w16cex="http://schemas.microsoft.com/office/word/2018/wordml/cex" xmlns:w16cid="http://schemas.microsoft.com/office/word/2016/wordml/cid" xmlns:w16="http://schemas.microsoft.com/office/word/2018/wordml" xmlns:w16du="http://schemas.microsoft.com/office/word/2023/wordml/word16du" xmlns:w16sdtdh="http://schemas.microsoft.com/office/word/2020/wordml/sdtdatahash" xmlns:w16sdtfl="http://schemas.microsoft.com/office/word/2024/wordml/sdtformatlock" xmlns:w16se="http://schemas.microsoft.com/office/word/2015/wordml/symex" mc:Ignorable="w14 w15 w16se w16cid w16 w16cex w16sdtdh w16sdtfl w16du">
+<w:styles xmlns:mc="http://schemas.openxmlformats.org/markup-compatibility/2006" xmlns:r="http://schemas.openxmlformats.org/officeDocument/2006/relationships" xmlns:w="http://schemas.openxmlformats.org/wordprocessingml/2006/main" xmlns:w14="http://schemas.microsoft.com/office/word/2010/wordml" xmlns:w15="http://schemas.microsoft.com/office/word/2012/wordml" xmlns:w16cex="http://schemas.microsoft.com/office/word/2018/wordml/cex" xmlns:w16cid="http://schemas.microsoft.com/office/word/2016/wordml/cid" xmlns:w16="http://schemas.microsoft.com/office/word/2018/wordml" xmlns:w16sdtdh="http://schemas.microsoft.com/office/word/2020/wordml/sdtdatahash" xmlns:w16se="http://schemas.microsoft.com/office/word/2015/wordml/symex" mc:Ignorable="w14 w15 w16se w16cid w16 w16cex w16sdtdh">
   <w:docDefaults>
     <w:rPrDefault>
       <w:rPr>
         <w:rFonts w:asciiTheme="minorHAnsi" w:eastAsiaTheme="minorHAnsi" w:hAnsiTheme="minorHAnsi" w:cstheme="minorBidi"/>
         <w:sz w:val="24"/>
         <w:szCs w:val="24"/>
-        <w:lang w:eastAsia="en-US" w:bidi="ar-SA"/>
+        <w:lang w:val="en-NL" w:eastAsia="en-US" w:bidi="ar-SA"/>
       </w:rPr>
     </w:rPrDefault>
     <w:pPrDefault/>
@@ -720,46 +650,6 @@
       <w:lang w:val="it-IT" w:eastAsia="it-IT"/>
     </w:rPr>
   </w:style>
-  <w:style w:type="paragraph" w:styleId="FootnoteText">
-    <w:name w:val="footnote text"/>
-    <w:basedOn w:val="Normal"/>
-    <w:link w:val="FootnoteTextChar"/>
-    <w:uiPriority w:val="99"/>
-    <w:semiHidden/>
-    <w:unhideWhenUsed/>
-    <w:rsid w:val="009E1873"/>
-    <w:pPr>
-      <w:spacing w:after="0" w:line="240" w:lineRule="auto"/>
-    </w:pPr>
-    <w:rPr>
-      <w:sz w:val="20"/>
-      <w:szCs w:val="20"/>
-    </w:rPr>
-  </w:style>
-  <w:style w:type="character" w:customStyle="1" w:styleId="FootnoteTextChar">
-    <w:name w:val="Footnote Text Char"/>
-    <w:basedOn w:val="DefaultParagraphFont"/>
-    <w:link w:val="FootnoteText"/>
-    <w:uiPriority w:val="99"/>
-    <w:semiHidden/>
-    <w:rsid w:val="009E1873"/>
-    <w:rPr>
-      <w:sz w:val="20"/>
-      <w:szCs w:val="20"/>
-      <w:lang w:val="it-IT" w:eastAsia="it-IT"/>
-    </w:rPr>
-  </w:style>
-  <w:style w:type="character" w:styleId="FootnoteReference">
-    <w:name w:val="footnote reference"/>
-    <w:basedOn w:val="DefaultParagraphFont"/>
-    <w:uiPriority w:val="99"/>
-    <w:semiHidden/>
-    <w:unhideWhenUsed/>
-    <w:rsid w:val="009E1873"/>
-    <w:rPr>
-      <w:vertAlign w:val="superscript"/>
-    </w:rPr>
-  </w:style>
 </w:styles>
 </file>
 
@@ -1056,16 +946,4 @@
     </a:ext>
   </a:extLst>
 </a:theme>
-</file>
-
-<file path=customXml/item1.xml><?xml version="1.0" encoding="utf-8"?>
-<b:Sources xmlns:b="http://schemas.openxmlformats.org/officeDocument/2006/bibliography" xmlns="http://schemas.openxmlformats.org/officeDocument/2006/bibliography" SelectedStyle="/APASixthEditionOfficeOnline.xsl" StyleName="APA" Version="6"/>
-</file>
-
-<file path=customXml/itemProps1.xml><?xml version="1.0" encoding="utf-8"?>
-<ds:datastoreItem xmlns:ds="http://schemas.openxmlformats.org/officeDocument/2006/customXml" ds:itemID="{DC756D4C-F0A0-514D-A99B-A5D863ECD03C}">
-  <ds:schemaRefs>
-    <ds:schemaRef ds:uri="http://schemas.openxmlformats.org/officeDocument/2006/bibliography"/>
-  </ds:schemaRefs>
-</ds:datastoreItem>
 </file>
</xml_diff>